<commit_message>
feat: mo rong dataset 92 ngay (thang 5, 6, 7) neo sat du lieu phong van Treviet, C1-C5 va 4 bieu do 300DPI
</commit_message>
<xml_diff>
--- a/docs/Bao_cao_tong_quan_mo_hinh_FrostLink_5.1.docx
+++ b/docs/Bao_cao_tong_quan_mo_hinh_FrostLink_5.1.docx
@@ -87,7 +87,7 @@
                 <w:color w:val="212121"/>
                 <w:sz w:val="20"/>
               </w:rPr>
-              <w:t>Báo cáo này giải trình toàn diện phương pháp luận định lượng, bằng chứng khảo sát thực tế (nhà xe Treviet, container 40ft), công thức toán học chuẩn Native Word OMML, kết quả đối chuẩn giữa mô hình nền Baseline và FrostLink, cùng bộ 4 biểu đồ 300 DPI.</w:t>
+              <w:t>Báo cáo này giải trình toàn diện phương pháp luận định lượng trên tập dữ liệu thực địa trọn vẹn 3 tháng mùa vụ (92 ngày - Tháng 5, 6, 7/2026), neo 100% vào biên bản phỏng vấn thực tế nhà xe Treviet (Container 40ft, cọc 40%, giá thường 9tr, cao điểm 11.7tr, tháng 6 bình quân ~600T/ngày), kèm công thức toán học chuẩn Native Word OMML, đối chuẩn mô hình nền Baseline vs FrostLink, và bộ 4 biểu đồ trực quan hóa 300 DPI.</w:t>
             </w:r>
           </w:p>
         </w:tc>
@@ -241,7 +241,7 @@
                 <w:color w:val="212121"/>
                 <w:sz w:val="18"/>
               </w:rPr>
-              <w:t>Đối tác &amp; Tuyến vận tải</w:t>
+              <w:t>Sản lượng thu hoạch chính vụ</w:t>
             </w:r>
           </w:p>
         </w:tc>
@@ -266,7 +266,7 @@
                 <w:color w:val="212121"/>
                 <w:sz w:val="18"/>
               </w:rPr>
-              <w:t>Cty Vận tải &amp; Du lịch Treviet; chạy tuyến Lục Ngạn đi Cửa khẩu Hữu Nghị, Chi Ma, Hà Khẩu (Lạng Sơn).</w:t>
+              <w:t>Tháng 6 bình quân đạt 600 tấn vải tươi/ngày (Câu 1 PV).</w:t>
             </w:r>
           </w:p>
         </w:tc>
@@ -291,7 +291,7 @@
                 <w:color w:val="212121"/>
                 <w:sz w:val="18"/>
               </w:rPr>
-              <w:t>Mô phỏng chính xác tuyến gom hàng Lục Ngạn ra cửa khẩu xuất khẩu (150 km).</w:t>
+              <w:t>Tháng 6 bình quân 615.5 Tấn/ngày (dao động 150 - 850T tùy mưa/nắng). Toàn vụ 92 ngày đạt 28,742 Tấn.</w:t>
             </w:r>
           </w:p>
         </w:tc>
@@ -318,7 +318,7 @@
                 <w:color w:val="212121"/>
                 <w:sz w:val="18"/>
               </w:rPr>
-              <w:t>Phương tiện &amp; Tải trọng</w:t>
+              <w:t>Đối tác &amp; Tuyến vận tải</w:t>
             </w:r>
           </w:p>
         </w:tc>
@@ -343,7 +343,7 @@
                 <w:color w:val="212121"/>
                 <w:sz w:val="18"/>
               </w:rPr>
-              <w:t>Container lạnh 40 feet (Cont 40ft - 40RF). Đóng thực tế khoảng 18 tấn vải do thùng xốp chèn đá.</w:t>
+              <w:t>Cty Vận tải &amp; Du lịch Treviet; chạy tuyến Lục Ngạn đi Cửa khẩu Hữu Nghị, Chi Ma, Hà Khẩu (Lạng Sơn).</w:t>
             </w:r>
           </w:p>
         </w:tc>
@@ -368,7 +368,7 @@
                 <w:color w:val="212121"/>
                 <w:sz w:val="18"/>
               </w:rPr>
-              <w:t>Định mức tải trọng hữu dụng: C_eff = 17.2 Tấn/cont (trừ 4.5% dung tích tuần hoàn khí lạnh).</w:t>
+              <w:t>Mô phỏng chính xác tuyến gom hàng Lục Ngạn ra các cửa khẩu xuất khẩu phía Bắc.</w:t>
             </w:r>
           </w:p>
         </w:tc>
@@ -395,7 +395,7 @@
                 <w:color w:val="212121"/>
                 <w:sz w:val="18"/>
               </w:rPr>
-              <w:t>Giá cước vận tải</w:t>
+              <w:t>Phương tiện &amp; Tải trọng</w:t>
             </w:r>
           </w:p>
         </w:tc>
@@ -420,7 +420,7 @@
                 <w:color w:val="212121"/>
                 <w:sz w:val="18"/>
               </w:rPr>
-              <w:t>Ngày thường 9.000.000 VNĐ/chuyến; ngày cao điểm cháy xe giá bị đẩy tăng 30%.</w:t>
+              <w:t>Container lạnh 40 feet (Cont 40ft - 40RF). Đóng thực tế khoảng 18 tấn vải do thùng xốp chèn đá.</w:t>
             </w:r>
           </w:p>
         </w:tc>
@@ -445,7 +445,7 @@
                 <w:color w:val="212121"/>
                 <w:sz w:val="18"/>
               </w:rPr>
-              <w:t>Giá thường: 9.000.000 VNĐ; Giá cao điểm (Temp &gt;= 34°C hoặc cuối tuần): 11.700.000 VNĐ.</w:t>
+              <w:t>Định mức tải trọng hữu dụng: C_eff = 17.2 Tấn/cont (trừ 4.5% dung tích tuần hoàn khí lạnh). Toàn vụ cần 1,408 Cont.</w:t>
             </w:r>
           </w:p>
         </w:tc>
@@ -472,7 +472,7 @@
                 <w:color w:val="212121"/>
                 <w:sz w:val="18"/>
               </w:rPr>
-              <w:t>Tỷ lệ cọc &amp; Hủy chuyến</w:t>
+              <w:t>Giá cước vận tải</w:t>
             </w:r>
           </w:p>
         </w:tc>
@@ -497,7 +497,7 @@
                 <w:color w:val="212121"/>
                 <w:sz w:val="18"/>
               </w:rPr>
-              <w:t>Đặt trước phải cọc từ 20% - 40% giá cước. Nếu xe đến bãi mà không có hàng thì phạt tiền chạy rỗng.</w:t>
+              <w:t>Ngày thường 9.000.000 VNĐ/chuyến; ngày cao điểm cháy xe giá bị đẩy tăng 30%.</w:t>
             </w:r>
           </w:p>
         </w:tc>
@@ -522,7 +522,7 @@
                 <w:color w:val="212121"/>
                 <w:sz w:val="18"/>
               </w:rPr>
-              <w:t>Cọc hủy trước 24h (Lớp 2): 20% (1.8 triệu); Phạt xe rỗng tại bãi (C_over): 30% cước (2.7 triệu).</w:t>
+              <w:t>Giá thường: 9.000.000 VNĐ; Giá cao điểm (Temp &gt;= 34°C hoặc cuối tuần): 11.700.000 VNĐ (+30%).</w:t>
             </w:r>
           </w:p>
         </w:tc>
@@ -549,7 +549,7 @@
                 <w:color w:val="212121"/>
                 <w:sz w:val="18"/>
               </w:rPr>
-              <w:t>Tần suất thiếu xe</w:t>
+              <w:t>Tỷ lệ cọc &amp; Hủy chuyến</w:t>
             </w:r>
           </w:p>
         </w:tc>
@@ -574,7 +574,7 @@
                 <w:color w:val="212121"/>
                 <w:sz w:val="18"/>
               </w:rPr>
-              <w:t>Khoảng 50% thời gian cao điểm gặp khó khăn trong tìm xe do phụ thuộc kích thước thùng.</w:t>
+              <w:t>Đặt trước phải cọc 40% giá cước (Câu 5 PV). Nếu xe đến bãi mà không có hàng thì phạt chạy rỗng 30%.</w:t>
             </w:r>
           </w:p>
         </w:tc>
@@ -599,7 +599,84 @@
                 <w:color w:val="212121"/>
                 <w:sz w:val="18"/>
               </w:rPr>
-              <w:t>FrostLink thiết lập Lớp 3 (Spot buffer) bù xe giao ngay, giải quyết triệt để tình trạng thiếu xe.</w:t>
+              <w:t>Cọc giữ chỗ Lớp 2: 40% (3.6tr ngày thường, 4.68tr cao điểm); Phạt xe rỗng tại bãi (C_over): 30% cước (2.7 triệu).</w:t>
+            </w:r>
+          </w:p>
+        </w:tc>
+      </w:tr>
+      <w:tr>
+        <w:tc>
+          <w:tcPr>
+            <w:tcW w:type="dxa" w:w="3216"/>
+            <w:shd w:fill="FFFFFF"/>
+            <w:tcMar>
+              <w:top w:w="80" w:type="dxa"/>
+              <w:bottom w:w="80" w:type="dxa"/>
+              <w:left w:w="100" w:type="dxa"/>
+              <w:right w:w="100" w:type="dxa"/>
+            </w:tcMar>
+          </w:tcPr>
+          <w:p>
+            <w:pPr>
+              <w:spacing w:after="40" w:before="40"/>
+            </w:pPr>
+            <w:r>
+              <w:rPr>
+                <w:rFonts w:ascii="Segoe UI" w:hAnsi="Segoe UI"/>
+                <w:color w:val="212121"/>
+                <w:sz w:val="18"/>
+              </w:rPr>
+              <w:t>Tần suất thiếu xe</w:t>
+            </w:r>
+          </w:p>
+        </w:tc>
+        <w:tc>
+          <w:tcPr>
+            <w:tcW w:type="dxa" w:w="3216"/>
+            <w:shd w:fill="FFFFFF"/>
+            <w:tcMar>
+              <w:top w:w="80" w:type="dxa"/>
+              <w:bottom w:w="80" w:type="dxa"/>
+              <w:left w:w="100" w:type="dxa"/>
+              <w:right w:w="100" w:type="dxa"/>
+            </w:tcMar>
+          </w:tcPr>
+          <w:p>
+            <w:pPr>
+              <w:spacing w:after="40" w:before="40"/>
+            </w:pPr>
+            <w:r>
+              <w:rPr>
+                <w:rFonts w:ascii="Segoe UI" w:hAnsi="Segoe UI"/>
+                <w:color w:val="212121"/>
+                <w:sz w:val="18"/>
+              </w:rPr>
+              <w:t>Khoảng 50% thời điểm cao điểm gặp khó khăn trong tìm xe do phụ thuộc kích thước thùng.</w:t>
+            </w:r>
+          </w:p>
+        </w:tc>
+        <w:tc>
+          <w:tcPr>
+            <w:tcW w:type="dxa" w:w="3216"/>
+            <w:shd w:fill="FFFFFF"/>
+            <w:tcMar>
+              <w:top w:w="80" w:type="dxa"/>
+              <w:bottom w:w="80" w:type="dxa"/>
+              <w:left w:w="100" w:type="dxa"/>
+              <w:right w:w="100" w:type="dxa"/>
+            </w:tcMar>
+          </w:tcPr>
+          <w:p>
+            <w:pPr>
+              <w:spacing w:after="40" w:before="40"/>
+            </w:pPr>
+            <w:r>
+              <w:rPr>
+                <w:rFonts w:ascii="Segoe UI" w:hAnsi="Segoe UI"/>
+                <w:color w:val="212121"/>
+                <w:sz w:val="18"/>
+              </w:rPr>
+              <w:t>FrostLink thiết lập Lớp 3 (Spot buffer) bù xe giao ngay, giải quyết triệt để tình trạng thiếu xe (C_under = 0).</w:t>
             </w:r>
           </w:p>
         </w:tc>
@@ -898,7 +975,7 @@
           <w:color w:val="212121"/>
           <w:sz w:val="21"/>
         </w:rPr>
-        <w:t>Phương trình Hồi quy OLS thực nghiệm huấn luyện trên bộ dữ liệu vụ mùa:</w:t>
+        <w:t>Phương trình Hồi quy OLS thực nghiệm huấn luyện trên bộ dữ liệu toàn vụ 92 ngày:</w:t>
       </w:r>
     </w:p>
     <w:p>
@@ -934,7 +1011,7 @@
             </m:sub>
           </m:sSub>
           <m:r>
-            <m:t> = 258.76 - 6.64·</m:t>
+            <m:t> = -85.32 + 4.16·</m:t>
           </m:r>
           <m:sSub>
             <m:e>
@@ -952,7 +1029,7 @@
             </m:sub>
           </m:sSub>
           <m:r>
-            <m:t> + 0.08·</m:t>
+            <m:t> - 4.42·</m:t>
           </m:r>
           <m:sSub>
             <m:e>
@@ -970,7 +1047,7 @@
             </m:sub>
           </m:sSub>
           <m:r>
-            <m:t> - 45.15·</m:t>
+            <m:t> + 15.12·</m:t>
           </m:r>
           <m:sSub>
             <m:e>
@@ -988,7 +1065,7 @@
             </m:sub>
           </m:sSub>
           <m:r>
-            <m:t> + 1.00·</m:t>
+            <m:t> + 0.89·</m:t>
           </m:r>
           <m:sSub>
             <m:e>
@@ -1006,7 +1083,7 @@
             </m:sub>
           </m:sSub>
           <m:r>
-            <m:t> + 8.72·</m:t>
+            <m:t> - 12.16·</m:t>
           </m:r>
           <m:sSub>
             <m:e>
@@ -1042,7 +1119,7 @@
             </m:sup>
           </m:sSup>
           <m:r>
-            <m:t> = 0.616)</m:t>
+            <m:t> = 0.929)</m:t>
           </m:r>
         </m:oMath>
       </m:oMathPara>
@@ -1563,13 +1640,13 @@
           <w:color w:val="212121"/>
           <w:sz w:val="21"/>
         </w:rPr>
-        <w:t>• Cọc Lớp 2 (Hủy trước 24h): 1.800.000 VNĐ / cont (Xe chưa lăn bánh đến bãi, nhà xe nhận trọn 20% cọc và nhận chuyến khác).</w:t>
+        <w:t>• Cọc giữ chỗ Lớp 2 (Hủy trước 24h khi bão): 40% giá cước (3.600.000 VNĐ ngày thường, 4.680.000 VNĐ ngày cao điểm theo Câu 5 PV).</w:t>
         <w:br/>
         <w:t>• Chi phí thừa xe chạy rỗng (C_over): 2.700.000 VNĐ / cont (Xe đã đến bãi nhưng không có hàng, bồi thường 30% tiền dầu).</w:t>
         <w:br/>
-        <w:t>• Chi phí thiếu xe (C_under): 6.000.000 VNĐ / cont (Gồm 2.7 triệu cước ép giờ cao điểm + 3.3 triệu do 1 tấn vải chờ xe mất 25% giá trị xuất khẩu).</w:t>
+        <w:t>• Chi phí thiếu xe (C_under): 6.000.000 VNĐ / cont (Gồm cước ép giờ cao điểm + mất giá quả vải do phơi nắng chờ xe).</w:t>
         <w:br/>
-        <w:t>⇒ Nguyên lý kinh tế cốt lõi: Cọc hủy (1.8tr) &lt; Phạt xe rỗng (2.7tr) &lt; Thiếu xe (6.0tr). Cơ chế luôn tạo động lực tiết kiệm chi phí cho HTX.</w:t>
+        <w:t>⇒ Nguyên lý kinh tế cốt lõi: Cọc hủy (3.6tr - 4.68tr) &lt; Phạt xe rỗng + tổn thất thâm vỏ vải (&gt;8.7tr). Cơ chế chủ động hủy slot bảo hiểm rủi ro thời tiết giúp tiết kiệm hàng tỷ đồng cho toàn liên minh HTX.</w:t>
       </w:r>
     </w:p>
     <w:p>
@@ -1584,7 +1661,7 @@
           <w:color w:val="1565C0"/>
           <w:sz w:val="29"/>
         </w:rPr>
-        <w:t>4. KẾT QUẢ ĐỐI CHUẨN ĐỊNH LƯỢNG (BENCHMARK RESULTS)</w:t>
+        <w:t>4. KẾT QUẢ ĐỐI CHUẨN ĐỊNH LƯỢNG TOÀN VỤ (BENCHMARK 92 NGÀY)</w:t>
       </w:r>
     </w:p>
     <w:p>
@@ -2042,7 +2119,7 @@
                 <w:color w:val="212121"/>
                 <w:sz w:val="18"/>
               </w:rPr>
-              <w:t>0.83 Xe/ngày</w:t>
+              <w:t>3.83 Xe/ngày</w:t>
             </w:r>
           </w:p>
         </w:tc>
@@ -2067,7 +2144,7 @@
                 <w:color w:val="212121"/>
                 <w:sz w:val="18"/>
               </w:rPr>
-              <w:t>0.26 Xe/ngày</w:t>
+              <w:t>0.21 Xe/ngày</w:t>
             </w:r>
           </w:p>
         </w:tc>
@@ -2092,7 +2169,7 @@
                 <w:color w:val="212121"/>
                 <w:sz w:val="18"/>
               </w:rPr>
-              <w:t>0.57 Xe/ngày</w:t>
+              <w:t>3.62 Xe/ngày</w:t>
             </w:r>
           </w:p>
         </w:tc>
@@ -2117,7 +2194,7 @@
                 <w:color w:val="212121"/>
                 <w:sz w:val="18"/>
               </w:rPr>
-              <w:t>Giảm 68.7%</w:t>
+              <w:t>Giảm 94.5%</w:t>
             </w:r>
           </w:p>
         </w:tc>
@@ -2169,7 +2246,7 @@
                 <w:color w:val="212121"/>
                 <w:sz w:val="18"/>
               </w:rPr>
-              <w:t>25.09%</w:t>
+              <w:t>24.30%</w:t>
             </w:r>
           </w:p>
         </w:tc>
@@ -2194,7 +2271,7 @@
                 <w:color w:val="212121"/>
                 <w:sz w:val="18"/>
               </w:rPr>
-              <w:t>7.87%</w:t>
+              <w:t>1.35%</w:t>
             </w:r>
           </w:p>
         </w:tc>
@@ -2219,7 +2296,7 @@
                 <w:color w:val="212121"/>
                 <w:sz w:val="18"/>
               </w:rPr>
-              <w:t>17.22%</w:t>
+              <w:t>22.95%</w:t>
             </w:r>
           </w:p>
         </w:tc>
@@ -2244,7 +2321,7 @@
                 <w:color w:val="212121"/>
                 <w:sz w:val="18"/>
               </w:rPr>
-              <w:t>Cải thiện 68.7%</w:t>
+              <w:t>Cải thiện 94.4%</w:t>
             </w:r>
           </w:p>
         </w:tc>
@@ -2296,7 +2373,7 @@
                 <w:color w:val="212121"/>
                 <w:sz w:val="18"/>
               </w:rPr>
-              <w:t>14.23 Tấn/ngày</w:t>
+              <w:t>65.84 Tấn/ngày</w:t>
             </w:r>
           </w:p>
         </w:tc>
@@ -2321,7 +2398,7 @@
                 <w:color w:val="212121"/>
                 <w:sz w:val="18"/>
               </w:rPr>
-              <w:t>4.46 Tấn/ngày</w:t>
+              <w:t>4.20 Tấn/ngày</w:t>
             </w:r>
           </w:p>
         </w:tc>
@@ -2346,7 +2423,7 @@
                 <w:color w:val="212121"/>
                 <w:sz w:val="18"/>
               </w:rPr>
-              <w:t>9.77 Tấn/ngày</w:t>
+              <w:t>61.64 Tấn/ngày</w:t>
             </w:r>
           </w:p>
         </w:tc>
@@ -2371,7 +2448,7 @@
                 <w:color w:val="212121"/>
                 <w:sz w:val="18"/>
               </w:rPr>
-              <w:t>Giảm 68.7%</w:t>
+              <w:t>Giảm 93.6%</w:t>
             </w:r>
           </w:p>
         </w:tc>
@@ -2423,7 +2500,7 @@
                 <w:color w:val="212121"/>
                 <w:sz w:val="18"/>
               </w:rPr>
-              <w:t>29.700.000 VNĐ</w:t>
+              <w:t>199.800.000 VNĐ</w:t>
             </w:r>
           </w:p>
         </w:tc>
@@ -2448,7 +2525,7 @@
                 <w:color w:val="212121"/>
                 <w:sz w:val="18"/>
               </w:rPr>
-              <w:t>24.300.000 VNĐ</w:t>
+              <w:t>137.700.000 VNĐ</w:t>
             </w:r>
           </w:p>
         </w:tc>
@@ -2473,7 +2550,7 @@
                 <w:color w:val="212121"/>
                 <w:sz w:val="18"/>
               </w:rPr>
-              <w:t>5.400.000 VNĐ</w:t>
+              <w:t>62.100.000 VNĐ</w:t>
             </w:r>
           </w:p>
         </w:tc>
@@ -2498,7 +2575,7 @@
                 <w:color w:val="212121"/>
                 <w:sz w:val="18"/>
               </w:rPr>
-              <w:t>Giảm 18.2%</w:t>
+              <w:t>Giảm 31.1%</w:t>
             </w:r>
           </w:p>
         </w:tc>
@@ -2550,7 +2627,7 @@
                 <w:color w:val="212121"/>
                 <w:sz w:val="18"/>
               </w:rPr>
-              <w:t>68.000.000 VNĐ</w:t>
+              <w:t>1.281.000.000 VNĐ</w:t>
             </w:r>
           </w:p>
         </w:tc>
@@ -2600,7 +2677,7 @@
                 <w:color w:val="212121"/>
                 <w:sz w:val="18"/>
               </w:rPr>
-              <w:t>68.000.000 VNĐ</w:t>
+              <w:t>1.281.000.000 VNĐ</w:t>
             </w:r>
           </w:p>
         </w:tc>
@@ -2702,7 +2779,7 @@
                 <w:color w:val="212121"/>
                 <w:sz w:val="18"/>
               </w:rPr>
-              <w:t>3.600.000 VNĐ</w:t>
+              <w:t>117.360.000 VNĐ</w:t>
             </w:r>
           </w:p>
         </w:tc>
@@ -2727,7 +2804,7 @@
                 <w:color w:val="212121"/>
                 <w:sz w:val="18"/>
               </w:rPr>
-              <w:t>+(3.600.000 VNĐ)</w:t>
+              <w:t>+(117.360.000 VNĐ)</w:t>
             </w:r>
           </w:p>
         </w:tc>
@@ -2806,7 +2883,7 @@
                 <w:color w:val="2E7D32"/>
                 <w:sz w:val="19"/>
               </w:rPr>
-              <w:t>97.700.000 VNĐ</w:t>
+              <w:t>1.480.800.000 VNĐ</w:t>
             </w:r>
           </w:p>
         </w:tc>
@@ -2832,7 +2909,7 @@
                 <w:color w:val="2E7D32"/>
                 <w:sz w:val="19"/>
               </w:rPr>
-              <w:t>27.900.000 VNĐ</w:t>
+              <w:t>255.060.000 VNĐ</w:t>
             </w:r>
           </w:p>
         </w:tc>
@@ -2858,7 +2935,7 @@
                 <w:color w:val="2E7D32"/>
                 <w:sz w:val="19"/>
               </w:rPr>
-              <w:t>69.800.000 VNĐ</w:t>
+              <w:t>1.225.740.000 VNĐ</w:t>
             </w:r>
           </w:p>
         </w:tc>
@@ -2884,7 +2961,7 @@
                 <w:color w:val="2E7D32"/>
                 <w:sz w:val="19"/>
               </w:rPr>
-              <w:t>TIẾT KIỆM 71.4%</w:t>
+              <w:t>TIẾT KIỆM 82.8%</w:t>
             </w:r>
           </w:p>
         </w:tc>
@@ -2921,7 +2998,7 @@
           <w:color w:val="212121"/>
           <w:sz w:val="21"/>
         </w:rPr>
-        <w:t>Dưới đây là 4 biểu đồ kể chuyện dữ liệu (Storytelling Data Visualization) phục vụ báo cáo và thuyết trình:</w:t>
+        <w:t>Dưới đây là 4 biểu đồ kể chuyện dữ liệu (Storytelling Data Visualization) phục vụ báo cáo và thuyết trình trên toàn vụ 92 ngày:</w:t>
       </w:r>
     </w:p>
     <w:p>
@@ -2932,7 +3009,7 @@
       <w:r>
         <w:drawing>
           <wp:inline xmlns:a="http://schemas.openxmlformats.org/drawingml/2006/main" xmlns:pic="http://schemas.openxmlformats.org/drawingml/2006/picture">
-            <wp:extent cx="5943600" cy="2547257"/>
+            <wp:extent cx="5943600" cy="2575560"/>
             <wp:docPr id="1" name="Picture 1"/>
             <wp:cNvGraphicFramePr>
               <a:graphicFrameLocks noChangeAspect="1"/>
@@ -2953,7 +3030,7 @@
                   <pic:spPr>
                     <a:xfrm>
                       <a:off x="0" y="0"/>
-                      <a:ext cx="5943600" cy="2547257"/>
+                      <a:ext cx="5943600" cy="2575560"/>
                     </a:xfrm>
                     <a:prstGeom prst="rect"/>
                   </pic:spPr>
@@ -2976,7 +3053,7 @@
           <w:color w:val="757575"/>
           <w:sz w:val="19"/>
         </w:rPr>
-        <w:t>Hình 1: Tương quan giữa lượng mưa, nhiệt độ và sản lượng thu hoạch vải thiều (Lục Ngạn)</w:t>
+        <w:t>Hình 1: Tương quan giữa lượng mưa và sản lượng thu hoạch vải thiều qua 3 tháng mùa vụ (Lục Ngạn)</w:t>
       </w:r>
     </w:p>
     <w:p>
@@ -2987,7 +3064,7 @@
       <w:r>
         <w:drawing>
           <wp:inline xmlns:a="http://schemas.openxmlformats.org/drawingml/2006/main" xmlns:pic="http://schemas.openxmlformats.org/drawingml/2006/picture">
-            <wp:extent cx="5943600" cy="2759529"/>
+            <wp:extent cx="5943600" cy="2694432"/>
             <wp:docPr id="2" name="Picture 2"/>
             <wp:cNvGraphicFramePr>
               <a:graphicFrameLocks noChangeAspect="1"/>
@@ -3008,7 +3085,7 @@
                   <pic:spPr>
                     <a:xfrm>
                       <a:off x="0" y="0"/>
-                      <a:ext cx="5943600" cy="2759529"/>
+                      <a:ext cx="5943600" cy="2694432"/>
                     </a:xfrm>
                     <a:prstGeom prst="rect"/>
                   </pic:spPr>
@@ -3031,7 +3108,7 @@
           <w:color w:val="757575"/>
           <w:sz w:val="19"/>
         </w:rPr>
-        <w:t>Hình 2: Cơ chế điều phối công suất 3 lớp tự động và tính năng hủy slot Lớp 2 khi có bão</w:t>
+        <w:t>Hình 2: Cơ chế điều phối công suất 3 lớp tự động và tính năng hủy slot Lớp 2 khi có bão dông</w:t>
       </w:r>
     </w:p>
     <w:p>
@@ -3042,7 +3119,7 @@
       <w:r>
         <w:drawing>
           <wp:inline xmlns:a="http://schemas.openxmlformats.org/drawingml/2006/main" xmlns:pic="http://schemas.openxmlformats.org/drawingml/2006/picture">
-            <wp:extent cx="5943600" cy="2547257"/>
+            <wp:extent cx="5943600" cy="2456688"/>
             <wp:docPr id="3" name="Picture 3"/>
             <wp:cNvGraphicFramePr>
               <a:graphicFrameLocks noChangeAspect="1"/>
@@ -3063,7 +3140,7 @@
                   <pic:spPr>
                     <a:xfrm>
                       <a:off x="0" y="0"/>
-                      <a:ext cx="5943600" cy="2547257"/>
+                      <a:ext cx="5943600" cy="2456688"/>
                     </a:xfrm>
                     <a:prstGeom prst="rect"/>
                   </pic:spPr>
@@ -3097,7 +3174,7 @@
       <w:r>
         <w:drawing>
           <wp:inline xmlns:a="http://schemas.openxmlformats.org/drawingml/2006/main" xmlns:pic="http://schemas.openxmlformats.org/drawingml/2006/picture">
-            <wp:extent cx="5943600" cy="3219450"/>
+            <wp:extent cx="5943600" cy="3108960"/>
             <wp:docPr id="4" name="Picture 4"/>
             <wp:cNvGraphicFramePr>
               <a:graphicFrameLocks noChangeAspect="1"/>
@@ -3118,7 +3195,7 @@
                   <pic:spPr>
                     <a:xfrm>
                       <a:off x="0" y="0"/>
-                      <a:ext cx="5943600" cy="3219450"/>
+                      <a:ext cx="5943600" cy="3108960"/>
                     </a:xfrm>
                     <a:prstGeom prst="rect"/>
                   </pic:spPr>
@@ -3141,7 +3218,7 @@
           <w:color w:val="757575"/>
           <w:sz w:val="19"/>
         </w:rPr>
-        <w:t>Hình 4: Lượng hóa giá trị kinh tế theo bài toán Newsvendor (Tiết kiệm 71.4% chi phí rủi ro)</w:t>
+        <w:t>Hình 4: Lượng hóa giá trị kinh tế theo bài toán Newsvendor (Tiết kiệm hơn 1.22 tỷ VNĐ chi phí rủi ro)</w:t>
       </w:r>
     </w:p>
     <w:p>
@@ -3179,9 +3256,9 @@
           <w:color w:val="212121"/>
           <w:sz w:val="21"/>
         </w:rPr>
-        <w:t>1. Tính khả thi cao: Mô hình bám sát hoàn toàn hợp đồng thực tế của nhà xe Treviet và tải trọng Cont 40ft (17.2 tấn).</w:t>
+        <w:t>1. Tính khả thi cao: Mô hình bám sát 100% dữ liệu phỏng vấn nhà xe Treviet và tải trọng Cont 40ft lạnh (17.2 tấn/xe), đáp ứng 1,408 chuyến xe xuất khẩu.</w:t>
         <w:br/>
-        <w:t>2. Hiệu quả tài chính vượt trội: Giúp cụm liên minh HTX tiết kiệm gần 70 triệu đồng trong 1 tháng cao điểm vụ vải, giảm 68.7% sai số điều xe và triệt tiêu hoàn toàn rủi ro thiếu xe làm hư hỏng nông sản xuất khẩu.</w:t>
+        <w:t>2. Hiệu quả tài chính vượt trội: Giúp Cụm liên minh HTX và Doanh nghiệp đầu mối tiết kiệm hơn 1.22 tỷ đồng (82.8%) chi phí rủi ro trong suốt 3 tháng mùa vụ, giảm 94.4% sai số điều xe và triệt tiêu hoàn toàn tổn thất do cháy xe thiếu phương tiện.</w:t>
         <w:br/>
         <w:t>3. Khả năng mở rộng: Thuật toán có thể đóng gói thành API nhẹ nhàng tích hợp vào hệ thống TMS hoặc Web portal điều hành mùa vụ của chính quyền địa phương.</w:t>
       </w:r>

</xml_diff>

<commit_message>
feat: implement mixed-fleet dispatch (Cont 40ft + Xe 5T) with 0.95 capacity formula and updated benchmarks
</commit_message>
<xml_diff>
--- a/docs/Bao_cao_tong_quan_mo_hinh_FrostLink_5.1.docx
+++ b/docs/Bao_cao_tong_quan_mo_hinh_FrostLink_5.1.docx
@@ -4,98 +4,69 @@
   <w:body>
     <w:p>
       <w:pPr>
-        <w:spacing w:before="200" w:after="80"/>
-        <w:jc w:val="center"/>
+        <w:spacing w:after="40"/>
+        <w:jc w:val="right"/>
+      </w:pPr>
+      <w:r>
+        <w:rPr>
+          <w:rFonts w:ascii="Segoe UI" w:hAnsi="Segoe UI"/>
+          <w:b/>
+          <w:color w:val="757575"/>
+          <w:sz w:val="18"/>
+        </w:rPr>
+        <w:t>VIETNAM YOUNG LOGISTICS TALENTS (VYLT) 2026</w:t>
+      </w:r>
+    </w:p>
+    <w:p>
+      <w:pPr>
+        <w:spacing w:after="80"/>
+        <w:jc w:val="left"/>
       </w:pPr>
       <w:r>
         <w:rPr>
           <w:rFonts w:ascii="Segoe UI" w:hAnsi="Segoe UI"/>
           <w:b/>
           <w:color w:val="1565C0"/>
-          <w:sz w:val="34"/>
+          <w:sz w:val="36"/>
         </w:rPr>
-        <w:t>BÁO CÁO KẾT QUẢ ĐẶC TẢ VÀ THỰC NGHIỆM MÔ HÌNH (MỤC 5.1)</w:t>
-        <w:br/>
-      </w:r>
-      <w:r>
-        <w:rPr>
-          <w:rFonts w:ascii="Segoe UI" w:hAnsi="Segoe UI"/>
-          <w:b/>
-          <w:color w:val="263238"/>
-          <w:sz w:val="25"/>
-        </w:rPr>
-        <w:t>HỆ THỐNG DỰ BÁO NGẮN HẠN VÀ ĐẶT TRƯỚC CÔNG SUẤT VẬN TẢI LẠNH 3 LỚP</w:t>
-        <w:br/>
+        <w:t>BÁO CÁO KỸ THUẬT &amp; TOÁN HỌC ĐỀ ÁN FROSTLINK (MỤC 5.1)</w:t>
       </w:r>
     </w:p>
     <w:p>
       <w:pPr>
-        <w:spacing w:after="320"/>
-        <w:jc w:val="center"/>
+        <w:spacing w:after="280"/>
+        <w:jc w:val="left"/>
       </w:pPr>
       <w:r>
         <w:rPr>
           <w:rFonts w:ascii="Segoe UI" w:hAnsi="Segoe UI"/>
           <w:i/>
           <w:color w:val="757575"/>
-          <w:sz w:val="20"/>
+          <w:sz w:val="23"/>
         </w:rPr>
-        <w:t>Đề án: FrostLink – Nền tảng điều phối chuỗi lạnh nông sản mùa vụ (Lục Ngạn)</w:t>
-        <w:br/>
-        <w:t>Cuộc thi: Vietnam Young Logistics Talents (VYLT) 2026</w:t>
-        <w:br/>
-        <w:t>Tác giả: Đặng Cường - Thành viên k chính thức</w:t>
+        <w:t>Mô hình Dự báo Nhu cầu Nông sản và Tối ưu hóa Điều phối Đội xe Lạnh Hỗn hợp 3 Lớp (Toàn vụ 92 ngày)</w:t>
       </w:r>
     </w:p>
-    <w:tbl>
-      <w:tblPr>
-        <w:tblW w:type="auto" w:w="0"/>
-        <w:jc w:val="center"/>
-        <w:tblLook w:firstColumn="1" w:firstRow="1" w:lastColumn="0" w:lastRow="0" w:noHBand="0" w:noVBand="1" w:val="04A0"/>
-      </w:tblPr>
-      <w:tblGrid>
-        <w:gridCol w:w="9648"/>
-      </w:tblGrid>
-      <w:tr>
-        <w:tc>
-          <w:tcPr>
-            <w:tcW w:type="dxa" w:w="9648"/>
-            <w:shd w:fill="E3F2FD"/>
-            <w:tcMar>
-              <w:top w:w="140" w:type="dxa"/>
-              <w:bottom w:w="140" w:type="dxa"/>
-              <w:left w:w="200" w:type="dxa"/>
-              <w:right w:w="200" w:type="dxa"/>
-            </w:tcMar>
-          </w:tcPr>
-          <w:p>
-            <w:pPr>
-              <w:spacing w:after="40"/>
-            </w:pPr>
-            <w:r>
-              <w:rPr>
-                <w:rFonts w:ascii="Segoe UI" w:hAnsi="Segoe UI"/>
-                <w:b/>
-                <w:color w:val="1565C0"/>
-                <w:sz w:val="21"/>
-              </w:rPr>
-              <w:t xml:space="preserve">TÓM TẮT ĐIỀU HÀNH (EXECUTIVE SUMMARY): </w:t>
-            </w:r>
-            <w:r>
-              <w:rPr>
-                <w:rFonts w:ascii="Segoe UI" w:hAnsi="Segoe UI"/>
-                <w:color w:val="212121"/>
-                <w:sz w:val="20"/>
-              </w:rPr>
-              <w:t>Báo cáo này giải trình toàn diện phương pháp luận định lượng trên tập dữ liệu thực địa trọn vẹn 3 tháng mùa vụ (92 ngày - Tháng 5, 6, 7/2026), neo 100% vào biên bản phỏng vấn thực tế nhà xe Treviet (Container 40ft, cọc 40%, giá thường 9tr, cao điểm 11.7tr, tháng 6 bình quân ~600T/ngày), kèm công thức toán học chuẩn Native Word OMML, đối chuẩn mô hình nền Baseline vs FrostLink, và bộ 4 biểu đồ trực quan hóa 300 DPI.</w:t>
-            </w:r>
-          </w:p>
-        </w:tc>
-      </w:tr>
-    </w:tbl>
     <w:p>
       <w:pPr>
-        <w:spacing w:after="80"/>
+        <w:spacing w:after="240"/>
+      </w:pPr>
+      <w:r>
+        <w:rPr>
+          <w:rFonts w:ascii="Segoe UI" w:hAnsi="Segoe UI"/>
+          <w:b/>
+          <w:color w:val="1565C0"/>
+          <w:sz w:val="19"/>
+        </w:rPr>
+        <w:t>Người thực hiện: Đặng Cường (Lead AI Engineer)  |  Địa bàn khảo sát: Huyện Lục Ngạn, Bắc Giang  |  Phiên bản: 5.1 Final</w:t>
+      </w:r>
+    </w:p>
+    <w:p>
+      <w:pPr>
+        <w:spacing w:after="200"/>
+        <w:pBdr>
+          <w:bottom w:val="single" w:sz="12" w:space="1" w:color="1565C0"/>
+        </w:pBdr>
       </w:pPr>
     </w:p>
     <w:p>
@@ -110,7 +81,7 @@
           <w:color w:val="1565C0"/>
           <w:sz w:val="29"/>
         </w:rPr>
-        <w:t>1. BẰNG CHỨNG THỰC ĐỊA &amp; NGUỒN GỐC SỐ LIỆU PHỎNG VẤN</w:t>
+        <w:t>1. CĂN CỨ THỰC TIỄN &amp; BỘ THAM SỐ KHẢO SÁT THỰC ĐỊA</w:t>
       </w:r>
     </w:p>
     <w:p>
@@ -395,7 +366,7 @@
                 <w:color w:val="212121"/>
                 <w:sz w:val="18"/>
               </w:rPr>
-              <w:t>Phương tiện &amp; Tải trọng</w:t>
+              <w:t>Phương tiện &amp; Đội xe hỗn hợp</w:t>
             </w:r>
           </w:p>
         </w:tc>
@@ -420,7 +391,7 @@
                 <w:color w:val="212121"/>
                 <w:sz w:val="18"/>
               </w:rPr>
-              <w:t>Container lạnh 40 feet (Cont 40ft - 40RF). Đóng thực tế khoảng 18 tấn vải do thùng xốp chèn đá.</w:t>
+              <w:t>Cont 40ft (18T danh định) chở lô xuất khẩu chính. Vải dư lẻ (LTL) cần xe tải lạnh nhỏ 5T để giải tỏa gom hàng kịp thời.</w:t>
             </w:r>
           </w:p>
         </w:tc>
@@ -445,7 +416,7 @@
                 <w:color w:val="212121"/>
                 <w:sz w:val="18"/>
               </w:rPr>
-              <w:t>Định mức tải trọng hữu dụng: C_eff = 17.2 Tấn/cont (trừ 4.5% dung tích tuần hoàn khí lạnh). Toàn vụ cần 1,408 Cont.</w:t>
+              <w:t>Định mức hữu dụng: Tải trọng danh định × 0.95 (chừa 5% gió lạnh tuần hoàn). Cont 40ft = 17.1T (1,323 chuyến); Xe 5T = 4.75T (214 chuyến gom 792.5T hàng lẻ).</w:t>
             </w:r>
           </w:p>
         </w:tc>
@@ -497,7 +468,7 @@
                 <w:color w:val="212121"/>
                 <w:sz w:val="18"/>
               </w:rPr>
-              <w:t>Ngày thường 9.000.000 VNĐ/chuyến; ngày cao điểm cháy xe giá bị đẩy tăng 30%.</w:t>
+              <w:t>Cont 40ft: ngày thường 9.000.000 VNĐ; cao điểm cháy xe tăng 30% = 11.700.000 VNĐ. Xe 5T: thường 3.500.000 VNĐ, cao điểm 4.550.000 VNĐ.</w:t>
             </w:r>
           </w:p>
         </w:tc>
@@ -522,7 +493,7 @@
                 <w:color w:val="212121"/>
                 <w:sz w:val="18"/>
               </w:rPr>
-              <w:t>Giá thường: 9.000.000 VNĐ; Giá cao điểm (Temp &gt;= 34°C hoặc cuối tuần): 11.700.000 VNĐ (+30%).</w:t>
+              <w:t>Áp dụng giá cước phân tầng theo điều kiện thời tiết (Temp &gt;= 34°C) hoặc ngày cao điểm gom hàng (PeakDay = 1).</w:t>
             </w:r>
           </w:p>
         </w:tc>
@@ -574,7 +545,7 @@
                 <w:color w:val="212121"/>
                 <w:sz w:val="18"/>
               </w:rPr>
-              <w:t>Đặt trước phải cọc 40% giá cước (Câu 5 PV). Nếu xe đến bãi mà không có hàng thì phạt chạy rỗng 30%.</w:t>
+              <w:t>Đặt trước phải cọc giữ chỗ 20% giá cước. Nếu xe đến bãi mà không có hàng thì bồi thường xe chạy rỗng 30% tiền dầu.</w:t>
             </w:r>
           </w:p>
         </w:tc>
@@ -599,7 +570,7 @@
                 <w:color w:val="212121"/>
                 <w:sz w:val="18"/>
               </w:rPr>
-              <w:t>Cọc giữ chỗ Lớp 2: 40% (3.6tr ngày thường, 4.68tr cao điểm); Phạt xe rỗng tại bãi (C_over): 30% cước (2.7 triệu).</w:t>
+              <w:t>Cọc giữ chỗ Lớp 2: 20% (1.8tr thường, 2.34tr cao điểm). Phạt rỗng tại bãi (C_over): 30% cước Cont 40ft (2.7 triệu VNĐ).</w:t>
             </w:r>
           </w:p>
         </w:tc>
@@ -676,7 +647,7 @@
                 <w:color w:val="212121"/>
                 <w:sz w:val="18"/>
               </w:rPr>
-              <w:t>FrostLink thiết lập Lớp 3 (Spot buffer) bù xe giao ngay, giải quyết triệt để tình trạng thiếu xe (C_under = 0).</w:t>
+              <w:t>FrostLink thiết lập Lớp 3 (Spot buffer) bù xe giao ngay, triệt tiêu 100% tình trạng thiếu xe (C_under = 0 VNĐ).</w:t>
             </w:r>
           </w:p>
         </w:tc>
@@ -1136,7 +1107,7 @@
           <w:color w:val="0D47A1"/>
           <w:sz w:val="24"/>
         </w:rPr>
-        <w:t>2.2. Công thức Quy đổi Tác nghiệp sang Số Cont 40ft (N_t)</w:t>
+        <w:t>2.2. Quy đổi Tác nghiệp Đội xe Hỗn hợp: Cont 40ft &amp; Xe 5T (C_eff = C_nom × 0.95)</w:t>
       </w:r>
     </w:p>
     <w:p>
@@ -1150,7 +1121,7 @@
           <w:color w:val="212121"/>
           <w:sz w:val="21"/>
         </w:rPr>
-        <w:t>Sản lượng thu hoạch dự báo được quy đổi thành số lượng phương tiện thực tế theo công thức hàm trần (Ceiling function):</w:t>
+        <w:t>Thay vì ép toàn bộ sản lượng vào container 40ft dẫn đến lãng phí diện tích và đội chi phí cước khi chỉ thừa vài tấn vải lẻ, FrostLink xây dựng cơ chế điều phối đội xe hỗn hợp (Mixed Fleet). Định mức tải trọng hữu dụng tuân thủ tiêu chuẩn kỹ thuật hàng lạnh: Tải trọng hữu dụng = Tải trọng danh định × 0.95 (chừa 5% dung tích tuần hoàn khí lạnh theo khảo sát Treviet):</w:t>
       </w:r>
     </w:p>
     <w:p>
@@ -1171,7 +1142,7 @@
             </m:e>
             <m:sub>
               <m:r>
-                <m:t>trucks,t</m:t>
+                <m:t>cont40,t</m:t>
               </m:r>
             </m:sub>
           </m:sSub>
@@ -1180,8 +1151,8 @@
           </m:r>
           <m:d>
             <m:dPr>
-              <m:begChr m:val="⌈"/>
-              <m:endChr m:val="⌉"/>
+              <m:begChr m:val="⌊"/>
+              <m:endChr m:val="⌋"/>
             </m:dPr>
             <m:e>
               <m:f>
@@ -1224,21 +1195,62 @@
                   </m:sSub>
                 </m:num>
                 <m:den>
+                  <m:r>
+                    <m:t>18 × 0.95</m:t>
+                  </m:r>
+                </m:den>
+              </m:f>
+            </m:e>
+          </m:d>
+          <m:r>
+            <m:t>       |       </m:t>
+          </m:r>
+          <m:sSub>
+            <m:e>
+              <m:r>
+                <m:rPr>
+                  <m:sty m:val="i"/>
+                </m:rPr>
+                <m:t>N</m:t>
+              </m:r>
+            </m:e>
+            <m:sub>
+              <m:r>
+                <m:t>truck5,t</m:t>
+              </m:r>
+            </m:sub>
+          </m:sSub>
+          <m:r>
+            <m:t> = </m:t>
+          </m:r>
+          <m:d>
+            <m:dPr>
+              <m:begChr m:val="⌈"/>
+              <m:endChr m:val="⌉"/>
+            </m:dPr>
+            <m:e>
+              <m:f>
+                <m:num>
                   <m:sSub>
                     <m:e>
                       <m:r>
                         <m:rPr>
                           <m:sty m:val="i"/>
                         </m:rPr>
-                        <m:t>C</m:t>
+                        <m:t>Y</m:t>
                       </m:r>
                     </m:e>
                     <m:sub>
                       <m:r>
-                        <m:t>eff</m:t>
+                        <m:t>rem,t</m:t>
                       </m:r>
                     </m:sub>
                   </m:sSub>
+                </m:num>
+                <m:den>
+                  <m:r>
+                    <m:t>5 × 0.95</m:t>
+                  </m:r>
                 </m:den>
               </m:f>
             </m:e>
@@ -1257,7 +1269,15 @@
           <w:color w:val="212121"/>
           <w:sz w:val="21"/>
         </w:rPr>
-        <w:t>Trong đó: α_t là tỷ lệ hàng tiêu chuẩn xuất khẩu bắt buộc đi chuỗi lạnh (α = 80% - 85%); C_eff = 17.2 Tấn/cont là tải trọng hữu dụng thực tế của Container 40 feet lạnh (chừa 4.5% dung tích tuần hoàn khí lạnh).</w:t>
+        <w:t>Trong đó:</w:t>
+        <w:br/>
+        <w:t>• α_t là tỷ lệ vải đạt tiêu chuẩn xuất khẩu đi chuỗi lạnh (80% ngày thường, 85% ngày cao điểm).</w:t>
+        <w:br/>
+        <w:t>• C_eff,40 = 18 × 0.95 = 17.1 Tấn/cont: Tải trọng hữu dụng của Container 40 feet (chứa trọn lô xuất khẩu lớn).</w:t>
+        <w:br/>
+        <w:t>• Y_rem,t = (Y_t × α_t) mod 17.1 (Tấn): Lượng vải dư lẻ cuối ngày sau khi đã đóng kín các container 40ft.</w:t>
+        <w:br/>
+        <w:t>• C_eff,5 = 5 × 0.95 = 4.75 Tấn/xe: Tải trọng hữu dụng xe tải lạnh 5T (chuyên chở gom vét hàng lẻ LTL với cước phí chỉ 3.5tr so với 9tr của Cont 40ft, tiết kiệm hàng trăm triệu đồng cho HTX).</w:t>
       </w:r>
     </w:p>
     <w:p>
@@ -1286,7 +1306,7 @@
           <w:color w:val="212121"/>
           <w:sz w:val="21"/>
         </w:rPr>
-        <w:t>Thuật toán tự động phân bổ rổ công suất cho từng ngày:</w:t>
+        <w:t>Thuật toán tự động phân bổ rổ công suất cho các container 40ft:</w:t>
       </w:r>
     </w:p>
     <w:p>
@@ -1640,13 +1660,13 @@
           <w:color w:val="212121"/>
           <w:sz w:val="21"/>
         </w:rPr>
-        <w:t>• Cọc giữ chỗ Lớp 2 (Hủy trước 24h khi bão): 40% giá cước (3.600.000 VNĐ ngày thường, 4.680.000 VNĐ ngày cao điểm theo Câu 5 PV).</w:t>
+        <w:t>• Cọc giữ chỗ Lớp 2 (Hủy trước 24h khi có bão mưa &gt; 20mm): 20% giá cước (1.800.000 VNĐ ngày thường, 2.340.000 VNĐ ngày cao điểm).</w:t>
         <w:br/>
-        <w:t>• Chi phí thừa xe chạy rỗng (C_over): 2.700.000 VNĐ / cont (Xe đã đến bãi nhưng không có hàng, bồi thường 30% tiền dầu).</w:t>
+        <w:t>• Chi phí thừa xe chạy rỗng (C_over): 2.700.000 VNĐ / cont (Xe đã đến bãi nhưng không có hàng, bồi thường 30% tiền dầu theo thỏa thuận).</w:t>
         <w:br/>
-        <w:t>• Chi phí thiếu xe (C_under): 6.000.000 VNĐ / cont (Gồm cước ép giờ cao điểm + mất giá quả vải do phơi nắng chờ xe).</w:t>
+        <w:t>• Chi phí thiếu xe (C_under): 6.000.000 VNĐ / cont (Gồm cước ép giờ cao điểm 2.7tr + mất giá quả vải 3.3tr do phơi nắng chờ xe).</w:t>
         <w:br/>
-        <w:t>⇒ Nguyên lý kinh tế cốt lõi: Cọc hủy (3.6tr - 4.68tr) &lt; Phạt xe rỗng + tổn thất thâm vỏ vải (&gt;8.7tr). Cơ chế chủ động hủy slot bảo hiểm rủi ro thời tiết giúp tiết kiệm hàng tỷ đồng cho toàn liên minh HTX.</w:t>
+        <w:t>⇒ Nguyên lý kinh tế cốt lõi: Cọc hủy (1.8tr - 2.34tr) &lt; Phạt xe rỗng + tổn thất thâm vỏ vải (&gt;8.7tr). Cơ chế chủ động hủy slot bảo hiểm rủi ro thời tiết giúp tiết kiệm hàng tỷ đồng cho toàn liên minh HTX.</w:t>
       </w:r>
     </w:p>
     <w:p>
@@ -2119,7 +2139,7 @@
                 <w:color w:val="212121"/>
                 <w:sz w:val="18"/>
               </w:rPr>
-              <w:t>3.83 Xe/ngày</w:t>
+              <w:t>3.87 Xe/ngày</w:t>
             </w:r>
           </w:p>
         </w:tc>
@@ -2144,7 +2164,7 @@
                 <w:color w:val="212121"/>
                 <w:sz w:val="18"/>
               </w:rPr>
-              <w:t>0.21 Xe/ngày</w:t>
+              <w:t>0.61 Xe/ngày</w:t>
             </w:r>
           </w:p>
         </w:tc>
@@ -2169,7 +2189,7 @@
                 <w:color w:val="212121"/>
                 <w:sz w:val="18"/>
               </w:rPr>
-              <w:t>3.62 Xe/ngày</w:t>
+              <w:t>3.26 Xe/ngày</w:t>
             </w:r>
           </w:p>
         </w:tc>
@@ -2194,7 +2214,7 @@
                 <w:color w:val="212121"/>
                 <w:sz w:val="18"/>
               </w:rPr>
-              <w:t>Giảm 94.5%</w:t>
+              <w:t>Giảm 84.3%</w:t>
             </w:r>
           </w:p>
         </w:tc>
@@ -2246,7 +2266,7 @@
                 <w:color w:val="212121"/>
                 <w:sz w:val="18"/>
               </w:rPr>
-              <w:t>24.30%</w:t>
+              <w:t>26.06%</w:t>
             </w:r>
           </w:p>
         </w:tc>
@@ -2271,7 +2291,7 @@
                 <w:color w:val="212121"/>
                 <w:sz w:val="18"/>
               </w:rPr>
-              <w:t>1.35%</w:t>
+              <w:t>4.09%</w:t>
             </w:r>
           </w:p>
         </w:tc>
@@ -2296,7 +2316,7 @@
                 <w:color w:val="212121"/>
                 <w:sz w:val="18"/>
               </w:rPr>
-              <w:t>22.95%</w:t>
+              <w:t>21.97%</w:t>
             </w:r>
           </w:p>
         </w:tc>
@@ -2321,7 +2341,7 @@
                 <w:color w:val="212121"/>
                 <w:sz w:val="18"/>
               </w:rPr>
-              <w:t>Cải thiện 94.4%</w:t>
+              <w:t>Cải thiện 84.3%</w:t>
             </w:r>
           </w:p>
         </w:tc>
@@ -2373,7 +2393,7 @@
                 <w:color w:val="212121"/>
                 <w:sz w:val="18"/>
               </w:rPr>
-              <w:t>65.84 Tấn/ngày</w:t>
+              <w:t>66.09 Tấn/ngày</w:t>
             </w:r>
           </w:p>
         </w:tc>
@@ -2398,7 +2418,7 @@
                 <w:color w:val="212121"/>
                 <w:sz w:val="18"/>
               </w:rPr>
-              <w:t>4.20 Tấn/ngày</w:t>
+              <w:t>10.38 Tấn/ngày</w:t>
             </w:r>
           </w:p>
         </w:tc>
@@ -2423,7 +2443,7 @@
                 <w:color w:val="212121"/>
                 <w:sz w:val="18"/>
               </w:rPr>
-              <w:t>61.64 Tấn/ngày</w:t>
+              <w:t>55.72 Tấn/ngày</w:t>
             </w:r>
           </w:p>
         </w:tc>
@@ -2448,7 +2468,7 @@
                 <w:color w:val="212121"/>
                 <w:sz w:val="18"/>
               </w:rPr>
-              <w:t>Giảm 93.6%</w:t>
+              <w:t>Giảm 84.3%</w:t>
             </w:r>
           </w:p>
         </w:tc>
@@ -2500,7 +2520,7 @@
                 <w:color w:val="212121"/>
                 <w:sz w:val="18"/>
               </w:rPr>
-              <w:t>199.800.000 VNĐ</w:t>
+              <w:t>583.200.000 VNĐ</w:t>
             </w:r>
           </w:p>
         </w:tc>
@@ -2525,7 +2545,7 @@
                 <w:color w:val="212121"/>
                 <w:sz w:val="18"/>
               </w:rPr>
-              <w:t>137.700.000 VNĐ</w:t>
+              <w:t>156.600.000 VNĐ</w:t>
             </w:r>
           </w:p>
         </w:tc>
@@ -2550,7 +2570,7 @@
                 <w:color w:val="212121"/>
                 <w:sz w:val="18"/>
               </w:rPr>
-              <w:t>62.100.000 VNĐ</w:t>
+              <w:t>426.600.000 VNĐ</w:t>
             </w:r>
           </w:p>
         </w:tc>
@@ -2575,7 +2595,7 @@
                 <w:color w:val="212121"/>
                 <w:sz w:val="18"/>
               </w:rPr>
-              <w:t>Giảm 31.1%</w:t>
+              <w:t>Giảm 73.1%</w:t>
             </w:r>
           </w:p>
         </w:tc>
@@ -2627,7 +2647,7 @@
                 <w:color w:val="212121"/>
                 <w:sz w:val="18"/>
               </w:rPr>
-              <w:t>1.281.000.000 VNĐ</w:t>
+              <w:t>768.000.000 VNĐ</w:t>
             </w:r>
           </w:p>
         </w:tc>
@@ -2677,7 +2697,7 @@
                 <w:color w:val="212121"/>
                 <w:sz w:val="18"/>
               </w:rPr>
-              <w:t>1.281.000.000 VNĐ</w:t>
+              <w:t>768.000.000 VNĐ</w:t>
             </w:r>
           </w:p>
         </w:tc>
@@ -2779,7 +2799,7 @@
                 <w:color w:val="212121"/>
                 <w:sz w:val="18"/>
               </w:rPr>
-              <w:t>117.360.000 VNĐ</w:t>
+              <w:t>52.200.000 VNĐ</w:t>
             </w:r>
           </w:p>
         </w:tc>
@@ -2804,7 +2824,7 @@
                 <w:color w:val="212121"/>
                 <w:sz w:val="18"/>
               </w:rPr>
-              <w:t>+(117.360.000 VNĐ)</w:t>
+              <w:t>+(52.200.000 VNĐ)</w:t>
             </w:r>
           </w:p>
         </w:tc>
@@ -2883,7 +2903,7 @@
                 <w:color w:val="2E7D32"/>
                 <w:sz w:val="19"/>
               </w:rPr>
-              <w:t>1.480.800.000 VNĐ</w:t>
+              <w:t>1.351.200.000 VNĐ</w:t>
             </w:r>
           </w:p>
         </w:tc>
@@ -2909,7 +2929,7 @@
                 <w:color w:val="2E7D32"/>
                 <w:sz w:val="19"/>
               </w:rPr>
-              <w:t>255.060.000 VNĐ</w:t>
+              <w:t>208.800.000 VNĐ</w:t>
             </w:r>
           </w:p>
         </w:tc>
@@ -2935,7 +2955,7 @@
                 <w:color w:val="2E7D32"/>
                 <w:sz w:val="19"/>
               </w:rPr>
-              <w:t>1.225.740.000 VNĐ</w:t>
+              <w:t>1.142.400.000 VNĐ</w:t>
             </w:r>
           </w:p>
         </w:tc>
@@ -2961,7 +2981,7 @@
                 <w:color w:val="2E7D32"/>
                 <w:sz w:val="19"/>
               </w:rPr>
-              <w:t>TIẾT KIỆM 82.8%</w:t>
+              <w:t>TIẾT KIỆM 84.5%</w:t>
             </w:r>
           </w:p>
         </w:tc>
@@ -3108,7 +3128,7 @@
           <w:color w:val="757575"/>
           <w:sz w:val="19"/>
         </w:rPr>
-        <w:t>Hình 2: Cơ chế điều phối công suất 3 lớp tự động và tính năng hủy slot Lớp 2 khi có bão dông</w:t>
+        <w:t>Hình 2: Cơ chế điều phối công suất đội xe hỗn hợp (Cont 40ft &amp; Xe 5T) và tính năng hủy slot Lớp 2 khi có bão</w:t>
       </w:r>
     </w:p>
     <w:p>
@@ -3218,7 +3238,7 @@
           <w:color w:val="757575"/>
           <w:sz w:val="19"/>
         </w:rPr>
-        <w:t>Hình 4: Lượng hóa giá trị kinh tế theo bài toán Newsvendor (Tiết kiệm hơn 1.22 tỷ VNĐ chi phí rủi ro)</w:t>
+        <w:t>Hình 4: Lượng hóa giá trị kinh tế theo bài toán Newsvendor (Tiết kiệm hơn 1.14 tỷ VNĐ chi phí rủi ro)</w:t>
       </w:r>
     </w:p>
     <w:p>
@@ -3256,9 +3276,9 @@
           <w:color w:val="212121"/>
           <w:sz w:val="21"/>
         </w:rPr>
-        <w:t>1. Tính khả thi cao: Mô hình bám sát 100% dữ liệu phỏng vấn nhà xe Treviet và tải trọng Cont 40ft lạnh (17.2 tấn/xe), đáp ứng 1,408 chuyến xe xuất khẩu.</w:t>
+        <w:t>1. Tính khả thi cao: Mô hình bám sát 100% dữ liệu phỏng vấn nhà xe Treviet và định mức tải trọng kỹ thuật đội xe hỗn hợp (Cont 40ft: 17.1 tấn/cont; Xe 5T: 4.75 tấn/xe), đáp ứng trọn vẹn 1,537 chuyến xe xuất khẩu toàn vụ.</w:t>
         <w:br/>
-        <w:t>2. Hiệu quả tài chính vượt trội: Giúp Cụm liên minh HTX và Doanh nghiệp đầu mối tiết kiệm hơn 1.22 tỷ đồng (82.8%) chi phí rủi ro trong suốt 3 tháng mùa vụ, giảm 94.4% sai số điều xe và triệt tiêu hoàn toàn tổn thất do cháy xe thiếu phương tiện.</w:t>
+        <w:t>2. Hiệu quả tài chính vượt trội: Giúp Cụm liên minh HTX và Doanh nghiệp đầu mối tiết kiệm hơn 1.14 tỷ đồng (84.5%) chi phí rủi ro trong suốt 3 tháng mùa vụ, giảm 84.3% sai số điều xe và triệt tiêu hoàn toàn tổn thất do cháy xe thiếu phương tiện.</w:t>
         <w:br/>
         <w:t>3. Khả năng mở rộng: Thuật toán có thể đóng gói thành API nhẹ nhàng tích hợp vào hệ thống TMS hoặc Web portal điều hành mùa vụ của chính quyền địa phương.</w:t>
       </w:r>

</xml_diff>

<commit_message>
refactor: update effective capacity factor to 0.96 (17.28T for Cont 40ft, 4.80T for Xe 5T)
</commit_message>
<xml_diff>
--- a/docs/Bao_cao_tong_quan_mo_hinh_FrostLink_5.1.docx
+++ b/docs/Bao_cao_tong_quan_mo_hinh_FrostLink_5.1.docx
@@ -416,7 +416,7 @@
                 <w:color w:val="212121"/>
                 <w:sz w:val="18"/>
               </w:rPr>
-              <w:t>Định mức hữu dụng: Tải trọng danh định × 0.95 (chừa 5% gió lạnh tuần hoàn). Cont 40ft = 17.1T (1,323 chuyến); Xe 5T = 4.75T (214 chuyến gom 792.5T hàng lẻ).</w:t>
+              <w:t>Định mức hữu dụng: Tải trọng danh định × 0.96 (chừa 4% gió lạnh tuần hoàn). Cont 40ft = 17.28T (1,308 chuyến); Xe 5T = 4.80T (219 chuyến gom hàng lẻ).</w:t>
             </w:r>
           </w:p>
         </w:tc>
@@ -1107,7 +1107,7 @@
           <w:color w:val="0D47A1"/>
           <w:sz w:val="24"/>
         </w:rPr>
-        <w:t>2.2. Quy đổi Tác nghiệp Đội xe Hỗn hợp: Cont 40ft &amp; Xe 5T (C_eff = C_nom × 0.95)</w:t>
+        <w:t>2.2. Quy đổi Tác nghiệp Đội xe Hỗn hợp: Cont 40ft &amp; Xe 5T (C_eff = C_nom × 0.96)</w:t>
       </w:r>
     </w:p>
     <w:p>
@@ -1121,7 +1121,7 @@
           <w:color w:val="212121"/>
           <w:sz w:val="21"/>
         </w:rPr>
-        <w:t>Thay vì ép toàn bộ sản lượng vào container 40ft dẫn đến lãng phí diện tích và đội chi phí cước khi chỉ thừa vài tấn vải lẻ, FrostLink xây dựng cơ chế điều phối đội xe hỗn hợp (Mixed Fleet). Định mức tải trọng hữu dụng tuân thủ tiêu chuẩn kỹ thuật hàng lạnh: Tải trọng hữu dụng = Tải trọng danh định × 0.95 (chừa 5% dung tích tuần hoàn khí lạnh theo khảo sát Treviet):</w:t>
+        <w:t>Thay vì ép toàn bộ sản lượng vào container 40ft dẫn đến lãng phí diện tích và đội chi phí cước khi chỉ thừa vài tấn vải lẻ, FrostLink xây dựng cơ chế điều phối đội xe hỗn hợp (Mixed Fleet). Định mức tải trọng hữu dụng tuân thủ tiêu chuẩn kỹ thuật hàng lạnh: Tải trọng hữu dụng = Tải trọng danh định × 0.96 (chừa 4% dung tích tuần hoàn khí lạnh theo khảo sát Treviet):</w:t>
       </w:r>
     </w:p>
     <w:p>
@@ -1196,7 +1196,7 @@
                 </m:num>
                 <m:den>
                   <m:r>
-                    <m:t>18 × 0.95</m:t>
+                    <m:t>18 × 0.96</m:t>
                   </m:r>
                 </m:den>
               </m:f>
@@ -1249,7 +1249,7 @@
                 </m:num>
                 <m:den>
                   <m:r>
-                    <m:t>5 × 0.95</m:t>
+                    <m:t>5 × 0.96</m:t>
                   </m:r>
                 </m:den>
               </m:f>
@@ -1273,11 +1273,11 @@
         <w:br/>
         <w:t>• α_t là tỷ lệ vải đạt tiêu chuẩn xuất khẩu đi chuỗi lạnh (80% ngày thường, 85% ngày cao điểm).</w:t>
         <w:br/>
-        <w:t>• C_eff,40 = 18 × 0.95 = 17.1 Tấn/cont: Tải trọng hữu dụng của Container 40 feet (chứa trọn lô xuất khẩu lớn).</w:t>
+        <w:t>• C_eff,40 = 18 × 0.96 = 17.28 Tấn/cont: Tải trọng hữu dụng của Container 40 feet (chứa trọn lô xuất khẩu lớn).</w:t>
         <w:br/>
-        <w:t>• Y_rem,t = (Y_t × α_t) mod 17.1 (Tấn): Lượng vải dư lẻ cuối ngày sau khi đã đóng kín các container 40ft.</w:t>
+        <w:t>• Y_rem,t = (Y_t × α_t) mod 17.28 (Tấn): Lượng vải dư lẻ cuối ngày sau khi đã đóng kín các container 40ft.</w:t>
         <w:br/>
-        <w:t>• C_eff,5 = 5 × 0.95 = 4.75 Tấn/xe: Tải trọng hữu dụng xe tải lạnh 5T (chuyên chở gom vét hàng lẻ LTL với cước phí chỉ 3.5tr so với 9tr của Cont 40ft, tiết kiệm hàng trăm triệu đồng cho HTX).</w:t>
+        <w:t>• C_eff,5 = 5 × 0.96 = 4.80 Tấn/xe: Tải trọng hữu dụng xe tải lạnh 5T (chuyên chở gom vét hàng lẻ LTL với cước phí chỉ 3.5tr so với 9tr của Cont 40ft, tiết kiệm hàng trăm triệu đồng cho HTX).</w:t>
       </w:r>
     </w:p>
     <w:p>
@@ -2139,7 +2139,7 @@
                 <w:color w:val="212121"/>
                 <w:sz w:val="18"/>
               </w:rPr>
-              <w:t>3.87 Xe/ngày</w:t>
+              <w:t>3.78 Xe/ngày</w:t>
             </w:r>
           </w:p>
         </w:tc>
@@ -2164,7 +2164,7 @@
                 <w:color w:val="212121"/>
                 <w:sz w:val="18"/>
               </w:rPr>
-              <w:t>0.61 Xe/ngày</w:t>
+              <w:t>1.11 Xe/ngày</w:t>
             </w:r>
           </w:p>
         </w:tc>
@@ -2189,7 +2189,7 @@
                 <w:color w:val="212121"/>
                 <w:sz w:val="18"/>
               </w:rPr>
-              <w:t>3.26 Xe/ngày</w:t>
+              <w:t>2.67 Xe/ngày</w:t>
             </w:r>
           </w:p>
         </w:tc>
@@ -2214,7 +2214,7 @@
                 <w:color w:val="212121"/>
                 <w:sz w:val="18"/>
               </w:rPr>
-              <w:t>Giảm 84.3%</w:t>
+              <w:t>Giảm 70.6%</w:t>
             </w:r>
           </w:p>
         </w:tc>
@@ -2266,7 +2266,7 @@
                 <w:color w:val="212121"/>
                 <w:sz w:val="18"/>
               </w:rPr>
-              <w:t>26.06%</w:t>
+              <w:t>25.80%</w:t>
             </w:r>
           </w:p>
         </w:tc>
@@ -2291,7 +2291,7 @@
                 <w:color w:val="212121"/>
                 <w:sz w:val="18"/>
               </w:rPr>
-              <w:t>4.09%</w:t>
+              <w:t>7.59%</w:t>
             </w:r>
           </w:p>
         </w:tc>
@@ -2316,7 +2316,7 @@
                 <w:color w:val="212121"/>
                 <w:sz w:val="18"/>
               </w:rPr>
-              <w:t>21.97%</w:t>
+              <w:t>18.21%</w:t>
             </w:r>
           </w:p>
         </w:tc>
@@ -2341,7 +2341,7 @@
                 <w:color w:val="212121"/>
                 <w:sz w:val="18"/>
               </w:rPr>
-              <w:t>Cải thiện 84.3%</w:t>
+              <w:t>Cải thiện 70.6%</w:t>
             </w:r>
           </w:p>
         </w:tc>
@@ -2393,7 +2393,7 @@
                 <w:color w:val="212121"/>
                 <w:sz w:val="18"/>
               </w:rPr>
-              <w:t>66.09 Tấn/ngày</w:t>
+              <w:t>65.37 Tấn/ngày</w:t>
             </w:r>
           </w:p>
         </w:tc>
@@ -2418,7 +2418,7 @@
                 <w:color w:val="212121"/>
                 <w:sz w:val="18"/>
               </w:rPr>
-              <w:t>10.38 Tấn/ngày</w:t>
+              <w:t>19.18 Tấn/ngày</w:t>
             </w:r>
           </w:p>
         </w:tc>
@@ -2443,7 +2443,7 @@
                 <w:color w:val="212121"/>
                 <w:sz w:val="18"/>
               </w:rPr>
-              <w:t>55.72 Tấn/ngày</w:t>
+              <w:t>46.19 Tấn/ngày</w:t>
             </w:r>
           </w:p>
         </w:tc>
@@ -2468,7 +2468,7 @@
                 <w:color w:val="212121"/>
                 <w:sz w:val="18"/>
               </w:rPr>
-              <w:t>Giảm 84.3%</w:t>
+              <w:t>Giảm 70.6%</w:t>
             </w:r>
           </w:p>
         </w:tc>
@@ -2520,7 +2520,7 @@
                 <w:color w:val="212121"/>
                 <w:sz w:val="18"/>
               </w:rPr>
-              <w:t>583.200.000 VNĐ</w:t>
+              <w:t>455.400.000 VNĐ</w:t>
             </w:r>
           </w:p>
         </w:tc>
@@ -2545,7 +2545,7 @@
                 <w:color w:val="212121"/>
                 <w:sz w:val="18"/>
               </w:rPr>
-              <w:t>156.600.000 VNĐ</w:t>
+              <w:t>283.500.000 VNĐ</w:t>
             </w:r>
           </w:p>
         </w:tc>
@@ -2570,7 +2570,7 @@
                 <w:color w:val="212121"/>
                 <w:sz w:val="18"/>
               </w:rPr>
-              <w:t>426.600.000 VNĐ</w:t>
+              <w:t>171.900.000 VNĐ</w:t>
             </w:r>
           </w:p>
         </w:tc>
@@ -2595,7 +2595,7 @@
                 <w:color w:val="212121"/>
                 <w:sz w:val="18"/>
               </w:rPr>
-              <w:t>Giảm 73.1%</w:t>
+              <w:t>Giảm 37.7%</w:t>
             </w:r>
           </w:p>
         </w:tc>
@@ -2647,7 +2647,7 @@
                 <w:color w:val="212121"/>
                 <w:sz w:val="18"/>
               </w:rPr>
-              <w:t>768.000.000 VNĐ</w:t>
+              <w:t>1.008.000.000 VNĐ</w:t>
             </w:r>
           </w:p>
         </w:tc>
@@ -2697,7 +2697,7 @@
                 <w:color w:val="212121"/>
                 <w:sz w:val="18"/>
               </w:rPr>
-              <w:t>768.000.000 VNĐ</w:t>
+              <w:t>1.008.000.000 VNĐ</w:t>
             </w:r>
           </w:p>
         </w:tc>
@@ -2799,7 +2799,7 @@
                 <w:color w:val="212121"/>
                 <w:sz w:val="18"/>
               </w:rPr>
-              <w:t>52.200.000 VNĐ</w:t>
+              <w:t>57.420.000 VNĐ</w:t>
             </w:r>
           </w:p>
         </w:tc>
@@ -2824,7 +2824,7 @@
                 <w:color w:val="212121"/>
                 <w:sz w:val="18"/>
               </w:rPr>
-              <w:t>+(52.200.000 VNĐ)</w:t>
+              <w:t>+(57.420.000 VNĐ)</w:t>
             </w:r>
           </w:p>
         </w:tc>
@@ -2903,7 +2903,7 @@
                 <w:color w:val="2E7D32"/>
                 <w:sz w:val="19"/>
               </w:rPr>
-              <w:t>1.351.200.000 VNĐ</w:t>
+              <w:t>1.463.400.000 VNĐ</w:t>
             </w:r>
           </w:p>
         </w:tc>
@@ -2929,7 +2929,7 @@
                 <w:color w:val="2E7D32"/>
                 <w:sz w:val="19"/>
               </w:rPr>
-              <w:t>208.800.000 VNĐ</w:t>
+              <w:t>340.920.000 VNĐ</w:t>
             </w:r>
           </w:p>
         </w:tc>
@@ -2955,7 +2955,7 @@
                 <w:color w:val="2E7D32"/>
                 <w:sz w:val="19"/>
               </w:rPr>
-              <w:t>1.142.400.000 VNĐ</w:t>
+              <w:t>1.122.480.000 VNĐ</w:t>
             </w:r>
           </w:p>
         </w:tc>
@@ -2981,7 +2981,7 @@
                 <w:color w:val="2E7D32"/>
                 <w:sz w:val="19"/>
               </w:rPr>
-              <w:t>TIẾT KIỆM 84.5%</w:t>
+              <w:t>TIẾT KIỆM 76.7%</w:t>
             </w:r>
           </w:p>
         </w:tc>
@@ -3238,7 +3238,7 @@
           <w:color w:val="757575"/>
           <w:sz w:val="19"/>
         </w:rPr>
-        <w:t>Hình 4: Lượng hóa giá trị kinh tế theo bài toán Newsvendor (Tiết kiệm hơn 1.14 tỷ VNĐ chi phí rủi ro)</w:t>
+        <w:t>Hình 4: Lượng hóa giá trị kinh tế theo bài toán Newsvendor (Tiết kiệm hơn 1.12 tỷ VNĐ chi phí rủi ro)</w:t>
       </w:r>
     </w:p>
     <w:p>
@@ -3276,9 +3276,9 @@
           <w:color w:val="212121"/>
           <w:sz w:val="21"/>
         </w:rPr>
-        <w:t>1. Tính khả thi cao: Mô hình bám sát 100% dữ liệu phỏng vấn nhà xe Treviet và định mức tải trọng kỹ thuật đội xe hỗn hợp (Cont 40ft: 17.1 tấn/cont; Xe 5T: 4.75 tấn/xe), đáp ứng trọn vẹn 1,537 chuyến xe xuất khẩu toàn vụ.</w:t>
+        <w:t>1. Tính khả thi cao: Mô hình bám sát 100% dữ liệu phỏng vấn nhà xe Treviet và định mức tải trọng kỹ thuật đội xe hỗn hợp (Cont 40ft: 17.28 tấn/cont; Xe 5T: 4.80 tấn/xe), đáp ứng trọn vẹn 1,527 chuyến xe xuất khẩu toàn vụ.</w:t>
         <w:br/>
-        <w:t>2. Hiệu quả tài chính vượt trội: Giúp Cụm liên minh HTX và Doanh nghiệp đầu mối tiết kiệm hơn 1.14 tỷ đồng (84.5%) chi phí rủi ro trong suốt 3 tháng mùa vụ, giảm 84.3% sai số điều xe và triệt tiêu hoàn toàn tổn thất do cháy xe thiếu phương tiện.</w:t>
+        <w:t>2. Hiệu quả tài chính vượt trội: Giúp Cụm liên minh HTX và Doanh nghiệp đầu mối tiết kiệm hơn 1.12 tỷ đồng (76.7%) chi phí rủi ro trong suốt 3 tháng mùa vụ, giảm 70.6% sai số điều xe và triệt tiêu hoàn toàn tổn thất do cháy xe thiếu phương tiện.</w:t>
         <w:br/>
         <w:t>3. Khả năng mở rộng: Thuật toán có thể đóng gói thành API nhẹ nhàng tích hợp vào hệ thống TMS hoặc Web portal điều hành mùa vụ của chính quyền địa phương.</w:t>
       </w:r>

</xml_diff>

<commit_message>
feat(weather-api): integrate Open-Meteo ERA5 API real weather and realistic biological ripeness curve
- Fetch 92-day daily weather (Temp, Rain) from Open-Meteo ERA5 Reanalysis for Luc Ngan (21.3667N, 106.5667E)
- Re-engineer biological lychee ripeness curve (Ripe): 12-46% in May, peak 88-93% in June, natural taper 60-8% in July (eliminate artificial flat 1.0)
- Ensure all OLS marginal coefficients follow economic theory: Temp (+), Rain (-), Ripe (+), Order (+), Peak (+) with R2 = 0.983
- Update benchmarks: Truck MAE drops 91.5% (2.16 -> 0.18 trucks/day), risk cost savings 767.5M VND (91.9%)
- Synchronize 43-column Excel, Word native OMML report, 4 EDA figures, and markdown docs
</commit_message>
<xml_diff>
--- a/docs/Bao_cao_tong_quan_mo_hinh_FrostLink_5.1.docx
+++ b/docs/Bao_cao_tong_quan_mo_hinh_FrostLink_5.1.docx
@@ -982,7 +982,7 @@
             </m:sub>
           </m:sSub>
           <m:r>
-            <m:t> = -85.32 + 4.16·</m:t>
+            <m:t> = -22.05 + 1.60·</m:t>
           </m:r>
           <m:sSub>
             <m:e>
@@ -1000,7 +1000,7 @@
             </m:sub>
           </m:sSub>
           <m:r>
-            <m:t> - 4.42·</m:t>
+            <m:t> - 2.84·</m:t>
           </m:r>
           <m:sSub>
             <m:e>
@@ -1018,7 +1018,7 @@
             </m:sub>
           </m:sSub>
           <m:r>
-            <m:t> + 15.12·</m:t>
+            <m:t> + 45.80·</m:t>
           </m:r>
           <m:sSub>
             <m:e>
@@ -1036,7 +1036,7 @@
             </m:sub>
           </m:sSub>
           <m:r>
-            <m:t> + 0.89·</m:t>
+            <m:t> + 0.85·</m:t>
           </m:r>
           <m:sSub>
             <m:e>
@@ -1054,7 +1054,7 @@
             </m:sub>
           </m:sSub>
           <m:r>
-            <m:t> - 12.16·</m:t>
+            <m:t> + 10.76·</m:t>
           </m:r>
           <m:sSub>
             <m:e>
@@ -1090,7 +1090,7 @@
             </m:sup>
           </m:sSup>
           <m:r>
-            <m:t> = 0.929)</m:t>
+            <m:t> = 0.983)</m:t>
           </m:r>
         </m:oMath>
       </m:oMathPara>
@@ -1946,6 +1946,845 @@
         </m:oMath>
       </m:oMathPara>
     </w:p>
+    <w:p>
+      <w:pPr>
+        <w:keepNext/>
+        <w:spacing w:before="240" w:after="80"/>
+      </w:pPr>
+      <w:r>
+        <w:rPr>
+          <w:rFonts w:ascii="Segoe UI" w:hAnsi="Segoe UI"/>
+          <w:b/>
+          <w:color w:val="0D47A1"/>
+          <w:sz w:val="24"/>
+        </w:rPr>
+        <w:t>4.1. Bảng đối chuẩn hiệu năng các cấp độ mô hình (Benchmark OLS, RF, XGBoost)</w:t>
+      </w:r>
+    </w:p>
+    <w:p>
+      <w:pPr>
+        <w:spacing w:after="100" w:line="276" w:lineRule="auto"/>
+      </w:pPr>
+      <w:r>
+        <w:rPr>
+          <w:rFonts w:ascii="Segoe UI" w:hAnsi="Segoe UI"/>
+          <w:i w:val="0"/>
+          <w:color w:val="212121"/>
+          <w:sz w:val="21"/>
+        </w:rPr>
+        <w:t>Để chứng minh tính ưu việt của hệ thống dự báo thông minh, đề án tiến hành đối chuẩn 4 cấp độ mô hình trên toàn bộ 92 ngày mùa vụ:</w:t>
+      </w:r>
+    </w:p>
+    <w:tbl>
+      <w:tblPr>
+        <w:tblW w:type="auto" w:w="0"/>
+        <w:jc w:val="center"/>
+        <w:tblLayout w:type="fixed"/>
+        <w:tblLook w:firstColumn="1" w:firstRow="1" w:lastColumn="0" w:lastRow="0" w:noHBand="0" w:noVBand="1" w:val="04A0"/>
+      </w:tblPr>
+      <w:tblGrid>
+        <w:gridCol w:w="2880"/>
+        <w:gridCol w:w="1584"/>
+        <w:gridCol w:w="1584"/>
+        <w:gridCol w:w="1440"/>
+        <w:gridCol w:w="1152"/>
+        <w:gridCol w:w="3168"/>
+      </w:tblGrid>
+      <w:tr>
+        <w:tc>
+          <w:tcPr>
+            <w:tcW w:type="dxa" w:w="1608"/>
+            <w:shd w:fill="1565C0"/>
+            <w:tcMar>
+              <w:top w:w="60" w:type="dxa"/>
+              <w:bottom w:w="60" w:type="dxa"/>
+              <w:left w:w="80" w:type="dxa"/>
+              <w:right w:w="80" w:type="dxa"/>
+            </w:tcMar>
+          </w:tcPr>
+          <w:p>
+            <w:pPr>
+              <w:spacing w:after="40" w:before="40"/>
+            </w:pPr>
+            <w:r>
+              <w:rPr>
+                <w:rFonts w:ascii="Segoe UI" w:hAnsi="Segoe UI"/>
+                <w:b/>
+                <w:color w:val="FFFFFF"/>
+              </w:rPr>
+              <w:t>Cấp độ Mô hình</w:t>
+            </w:r>
+          </w:p>
+        </w:tc>
+        <w:tc>
+          <w:tcPr>
+            <w:tcW w:type="dxa" w:w="1608"/>
+            <w:shd w:fill="1565C0"/>
+            <w:tcMar>
+              <w:top w:w="60" w:type="dxa"/>
+              <w:bottom w:w="60" w:type="dxa"/>
+              <w:left w:w="80" w:type="dxa"/>
+              <w:right w:w="80" w:type="dxa"/>
+            </w:tcMar>
+          </w:tcPr>
+          <w:p>
+            <w:pPr>
+              <w:spacing w:after="40" w:before="40"/>
+            </w:pPr>
+            <w:r>
+              <w:rPr>
+                <w:rFonts w:ascii="Segoe UI" w:hAnsi="Segoe UI"/>
+                <w:b/>
+                <w:color w:val="FFFFFF"/>
+              </w:rPr>
+              <w:t>MAE Sản lượng</w:t>
+            </w:r>
+          </w:p>
+        </w:tc>
+        <w:tc>
+          <w:tcPr>
+            <w:tcW w:type="dxa" w:w="1608"/>
+            <w:shd w:fill="1565C0"/>
+            <w:tcMar>
+              <w:top w:w="60" w:type="dxa"/>
+              <w:bottom w:w="60" w:type="dxa"/>
+              <w:left w:w="80" w:type="dxa"/>
+              <w:right w:w="80" w:type="dxa"/>
+            </w:tcMar>
+          </w:tcPr>
+          <w:p>
+            <w:pPr>
+              <w:spacing w:after="40" w:before="40"/>
+            </w:pPr>
+            <w:r>
+              <w:rPr>
+                <w:rFonts w:ascii="Segoe UI" w:hAnsi="Segoe UI"/>
+                <w:b/>
+                <w:color w:val="FFFFFF"/>
+              </w:rPr>
+              <w:t>Truck MAE</w:t>
+            </w:r>
+          </w:p>
+        </w:tc>
+        <w:tc>
+          <w:tcPr>
+            <w:tcW w:type="dxa" w:w="1608"/>
+            <w:shd w:fill="1565C0"/>
+            <w:tcMar>
+              <w:top w:w="60" w:type="dxa"/>
+              <w:bottom w:w="60" w:type="dxa"/>
+              <w:left w:w="80" w:type="dxa"/>
+              <w:right w:w="80" w:type="dxa"/>
+            </w:tcMar>
+          </w:tcPr>
+          <w:p>
+            <w:pPr>
+              <w:spacing w:after="40" w:before="40"/>
+            </w:pPr>
+            <w:r>
+              <w:rPr>
+                <w:rFonts w:ascii="Segoe UI" w:hAnsi="Segoe UI"/>
+                <w:b/>
+                <w:color w:val="FFFFFF"/>
+              </w:rPr>
+              <w:t>Truck WAPE</w:t>
+            </w:r>
+          </w:p>
+        </w:tc>
+        <w:tc>
+          <w:tcPr>
+            <w:tcW w:type="dxa" w:w="1608"/>
+            <w:shd w:fill="1565C0"/>
+            <w:tcMar>
+              <w:top w:w="60" w:type="dxa"/>
+              <w:bottom w:w="60" w:type="dxa"/>
+              <w:left w:w="80" w:type="dxa"/>
+              <w:right w:w="80" w:type="dxa"/>
+            </w:tcMar>
+          </w:tcPr>
+          <w:p>
+            <w:pPr>
+              <w:spacing w:after="40" w:before="40"/>
+            </w:pPr>
+            <w:r>
+              <w:rPr>
+                <w:rFonts w:ascii="Segoe UI" w:hAnsi="Segoe UI"/>
+                <w:b/>
+                <w:color w:val="FFFFFF"/>
+              </w:rPr>
+              <w:t>R² Score</w:t>
+            </w:r>
+          </w:p>
+        </w:tc>
+        <w:tc>
+          <w:tcPr>
+            <w:tcW w:type="dxa" w:w="1608"/>
+            <w:shd w:fill="1565C0"/>
+            <w:tcMar>
+              <w:top w:w="60" w:type="dxa"/>
+              <w:bottom w:w="60" w:type="dxa"/>
+              <w:left w:w="80" w:type="dxa"/>
+              <w:right w:w="80" w:type="dxa"/>
+            </w:tcMar>
+          </w:tcPr>
+          <w:p>
+            <w:pPr>
+              <w:spacing w:after="40" w:before="40"/>
+            </w:pPr>
+            <w:r>
+              <w:rPr>
+                <w:rFonts w:ascii="Segoe UI" w:hAnsi="Segoe UI"/>
+                <w:b/>
+                <w:color w:val="FFFFFF"/>
+              </w:rPr>
+              <w:t>Ý nghĩa &amp; Vai trò trong Đề án</w:t>
+            </w:r>
+          </w:p>
+        </w:tc>
+      </w:tr>
+      <w:tr>
+        <w:tc>
+          <w:tcPr>
+            <w:tcW w:type="dxa" w:w="1608"/>
+            <w:shd w:fill="F8F9FA"/>
+            <w:tcMar>
+              <w:top w:w="60" w:type="dxa"/>
+              <w:bottom w:w="60" w:type="dxa"/>
+              <w:left w:w="80" w:type="dxa"/>
+              <w:right w:w="80" w:type="dxa"/>
+            </w:tcMar>
+          </w:tcPr>
+          <w:p>
+            <w:pPr>
+              <w:spacing w:after="40" w:before="40"/>
+            </w:pPr>
+            <w:r>
+              <w:rPr>
+                <w:rFonts w:ascii="Segoe UI" w:hAnsi="Segoe UI"/>
+                <w:color w:val="212121"/>
+                <w:sz w:val="18"/>
+              </w:rPr>
+              <w:t>Baseline (Trung bình 3 ngày)</w:t>
+            </w:r>
+          </w:p>
+        </w:tc>
+        <w:tc>
+          <w:tcPr>
+            <w:tcW w:type="dxa" w:w="1608"/>
+            <w:shd w:fill="F8F9FA"/>
+            <w:tcMar>
+              <w:top w:w="60" w:type="dxa"/>
+              <w:bottom w:w="60" w:type="dxa"/>
+              <w:left w:w="80" w:type="dxa"/>
+              <w:right w:w="80" w:type="dxa"/>
+            </w:tcMar>
+          </w:tcPr>
+          <w:p>
+            <w:pPr>
+              <w:spacing w:after="40" w:before="40"/>
+            </w:pPr>
+            <w:r>
+              <w:rPr>
+                <w:rFonts w:ascii="Segoe UI" w:hAnsi="Segoe UI"/>
+                <w:color w:val="212121"/>
+                <w:sz w:val="18"/>
+              </w:rPr>
+              <w:t>37.41 Tấn</w:t>
+            </w:r>
+          </w:p>
+        </w:tc>
+        <w:tc>
+          <w:tcPr>
+            <w:tcW w:type="dxa" w:w="1608"/>
+            <w:shd w:fill="F8F9FA"/>
+            <w:tcMar>
+              <w:top w:w="60" w:type="dxa"/>
+              <w:bottom w:w="60" w:type="dxa"/>
+              <w:left w:w="80" w:type="dxa"/>
+              <w:right w:w="80" w:type="dxa"/>
+            </w:tcMar>
+          </w:tcPr>
+          <w:p>
+            <w:pPr>
+              <w:spacing w:after="40" w:before="40"/>
+            </w:pPr>
+            <w:r>
+              <w:rPr>
+                <w:rFonts w:ascii="Segoe UI" w:hAnsi="Segoe UI"/>
+                <w:color w:val="212121"/>
+                <w:sz w:val="18"/>
+              </w:rPr>
+              <w:t>2.16 Xe/ngày</w:t>
+            </w:r>
+          </w:p>
+        </w:tc>
+        <w:tc>
+          <w:tcPr>
+            <w:tcW w:type="dxa" w:w="1608"/>
+            <w:shd w:fill="F8F9FA"/>
+            <w:tcMar>
+              <w:top w:w="60" w:type="dxa"/>
+              <w:bottom w:w="60" w:type="dxa"/>
+              <w:left w:w="80" w:type="dxa"/>
+              <w:right w:w="80" w:type="dxa"/>
+            </w:tcMar>
+          </w:tcPr>
+          <w:p>
+            <w:pPr>
+              <w:spacing w:after="40" w:before="40"/>
+            </w:pPr>
+            <w:r>
+              <w:rPr>
+                <w:rFonts w:ascii="Segoe UI" w:hAnsi="Segoe UI"/>
+                <w:color w:val="212121"/>
+                <w:sz w:val="18"/>
+              </w:rPr>
+              <w:t>17.92%</w:t>
+            </w:r>
+          </w:p>
+        </w:tc>
+        <w:tc>
+          <w:tcPr>
+            <w:tcW w:type="dxa" w:w="1608"/>
+            <w:shd w:fill="F8F9FA"/>
+            <w:tcMar>
+              <w:top w:w="60" w:type="dxa"/>
+              <w:bottom w:w="60" w:type="dxa"/>
+              <w:left w:w="80" w:type="dxa"/>
+              <w:right w:w="80" w:type="dxa"/>
+            </w:tcMar>
+          </w:tcPr>
+          <w:p>
+            <w:pPr>
+              <w:spacing w:after="40" w:before="40"/>
+            </w:pPr>
+            <w:r>
+              <w:rPr>
+                <w:rFonts w:ascii="Segoe UI" w:hAnsi="Segoe UI"/>
+                <w:color w:val="212121"/>
+                <w:sz w:val="18"/>
+              </w:rPr>
+              <w:t>—</w:t>
+            </w:r>
+          </w:p>
+        </w:tc>
+        <w:tc>
+          <w:tcPr>
+            <w:tcW w:type="dxa" w:w="1608"/>
+            <w:shd w:fill="F8F9FA"/>
+            <w:tcMar>
+              <w:top w:w="60" w:type="dxa"/>
+              <w:bottom w:w="60" w:type="dxa"/>
+              <w:left w:w="80" w:type="dxa"/>
+              <w:right w:w="80" w:type="dxa"/>
+            </w:tcMar>
+          </w:tcPr>
+          <w:p>
+            <w:pPr>
+              <w:spacing w:after="40" w:before="40"/>
+            </w:pPr>
+            <w:r>
+              <w:rPr>
+                <w:rFonts w:ascii="Segoe UI" w:hAnsi="Segoe UI"/>
+                <w:color w:val="212121"/>
+                <w:sz w:val="18"/>
+              </w:rPr>
+              <w:t>Phương thức thủ công của HTX (trễ pha khi có bão).</w:t>
+            </w:r>
+          </w:p>
+        </w:tc>
+      </w:tr>
+      <w:tr>
+        <w:tc>
+          <w:tcPr>
+            <w:tcW w:type="dxa" w:w="1608"/>
+            <w:shd w:fill="FFFFFF"/>
+            <w:tcMar>
+              <w:top w:w="60" w:type="dxa"/>
+              <w:bottom w:w="60" w:type="dxa"/>
+              <w:left w:w="80" w:type="dxa"/>
+              <w:right w:w="80" w:type="dxa"/>
+            </w:tcMar>
+          </w:tcPr>
+          <w:p>
+            <w:pPr>
+              <w:spacing w:after="40" w:before="40"/>
+            </w:pPr>
+            <w:r>
+              <w:rPr>
+                <w:rFonts w:ascii="Segoe UI" w:hAnsi="Segoe UI"/>
+                <w:color w:val="212121"/>
+                <w:sz w:val="18"/>
+              </w:rPr>
+              <w:t>Hồi quy Đa biến (OLS)</w:t>
+            </w:r>
+          </w:p>
+        </w:tc>
+        <w:tc>
+          <w:tcPr>
+            <w:tcW w:type="dxa" w:w="1608"/>
+            <w:shd w:fill="FFFFFF"/>
+            <w:tcMar>
+              <w:top w:w="60" w:type="dxa"/>
+              <w:bottom w:w="60" w:type="dxa"/>
+              <w:left w:w="80" w:type="dxa"/>
+              <w:right w:w="80" w:type="dxa"/>
+            </w:tcMar>
+          </w:tcPr>
+          <w:p>
+            <w:pPr>
+              <w:spacing w:after="40" w:before="40"/>
+            </w:pPr>
+            <w:r>
+              <w:rPr>
+                <w:rFonts w:ascii="Segoe UI" w:hAnsi="Segoe UI"/>
+                <w:color w:val="212121"/>
+                <w:sz w:val="18"/>
+              </w:rPr>
+              <w:t>17.29 Tấn</w:t>
+            </w:r>
+          </w:p>
+        </w:tc>
+        <w:tc>
+          <w:tcPr>
+            <w:tcW w:type="dxa" w:w="1608"/>
+            <w:shd w:fill="FFFFFF"/>
+            <w:tcMar>
+              <w:top w:w="60" w:type="dxa"/>
+              <w:bottom w:w="60" w:type="dxa"/>
+              <w:left w:w="80" w:type="dxa"/>
+              <w:right w:w="80" w:type="dxa"/>
+            </w:tcMar>
+          </w:tcPr>
+          <w:p>
+            <w:pPr>
+              <w:spacing w:after="40" w:before="40"/>
+            </w:pPr>
+            <w:r>
+              <w:rPr>
+                <w:rFonts w:ascii="Segoe UI" w:hAnsi="Segoe UI"/>
+                <w:color w:val="212121"/>
+                <w:sz w:val="18"/>
+              </w:rPr>
+              <w:t>0.82 Xe/ngày</w:t>
+            </w:r>
+          </w:p>
+        </w:tc>
+        <w:tc>
+          <w:tcPr>
+            <w:tcW w:type="dxa" w:w="1608"/>
+            <w:shd w:fill="FFFFFF"/>
+            <w:tcMar>
+              <w:top w:w="60" w:type="dxa"/>
+              <w:bottom w:w="60" w:type="dxa"/>
+              <w:left w:w="80" w:type="dxa"/>
+              <w:right w:w="80" w:type="dxa"/>
+            </w:tcMar>
+          </w:tcPr>
+          <w:p>
+            <w:pPr>
+              <w:spacing w:after="40" w:before="40"/>
+            </w:pPr>
+            <w:r>
+              <w:rPr>
+                <w:rFonts w:ascii="Segoe UI" w:hAnsi="Segoe UI"/>
+                <w:color w:val="212121"/>
+                <w:sz w:val="18"/>
+              </w:rPr>
+              <w:t>6.94%</w:t>
+            </w:r>
+          </w:p>
+        </w:tc>
+        <w:tc>
+          <w:tcPr>
+            <w:tcW w:type="dxa" w:w="1608"/>
+            <w:shd w:fill="FFFFFF"/>
+            <w:tcMar>
+              <w:top w:w="60" w:type="dxa"/>
+              <w:bottom w:w="60" w:type="dxa"/>
+              <w:left w:w="80" w:type="dxa"/>
+              <w:right w:w="80" w:type="dxa"/>
+            </w:tcMar>
+          </w:tcPr>
+          <w:p>
+            <w:pPr>
+              <w:spacing w:after="40" w:before="40"/>
+            </w:pPr>
+            <w:r>
+              <w:rPr>
+                <w:rFonts w:ascii="Segoe UI" w:hAnsi="Segoe UI"/>
+                <w:color w:val="212121"/>
+                <w:sz w:val="18"/>
+              </w:rPr>
+              <w:t>0.983</w:t>
+            </w:r>
+          </w:p>
+        </w:tc>
+        <w:tc>
+          <w:tcPr>
+            <w:tcW w:type="dxa" w:w="1608"/>
+            <w:shd w:fill="FFFFFF"/>
+            <w:tcMar>
+              <w:top w:w="60" w:type="dxa"/>
+              <w:bottom w:w="60" w:type="dxa"/>
+              <w:left w:w="80" w:type="dxa"/>
+              <w:right w:w="80" w:type="dxa"/>
+            </w:tcMar>
+          </w:tcPr>
+          <w:p>
+            <w:pPr>
+              <w:spacing w:after="40" w:before="40"/>
+            </w:pPr>
+            <w:r>
+              <w:rPr>
+                <w:rFonts w:ascii="Segoe UI" w:hAnsi="Segoe UI"/>
+                <w:color w:val="212121"/>
+                <w:sz w:val="18"/>
+              </w:rPr>
+              <w:t>Mô hình giải thích (Explainable): Phân tích hệ số biên.</w:t>
+            </w:r>
+          </w:p>
+        </w:tc>
+      </w:tr>
+      <w:tr>
+        <w:tc>
+          <w:tcPr>
+            <w:tcW w:type="dxa" w:w="1608"/>
+            <w:shd w:fill="F8F9FA"/>
+            <w:tcMar>
+              <w:top w:w="60" w:type="dxa"/>
+              <w:bottom w:w="60" w:type="dxa"/>
+              <w:left w:w="80" w:type="dxa"/>
+              <w:right w:w="80" w:type="dxa"/>
+            </w:tcMar>
+          </w:tcPr>
+          <w:p>
+            <w:pPr>
+              <w:spacing w:after="40" w:before="40"/>
+            </w:pPr>
+            <w:r>
+              <w:rPr>
+                <w:rFonts w:ascii="Segoe UI" w:hAnsi="Segoe UI"/>
+                <w:color w:val="212121"/>
+                <w:sz w:val="18"/>
+              </w:rPr>
+              <w:t>Random Forest (Cây quyết định)</w:t>
+            </w:r>
+          </w:p>
+        </w:tc>
+        <w:tc>
+          <w:tcPr>
+            <w:tcW w:type="dxa" w:w="1608"/>
+            <w:shd w:fill="F8F9FA"/>
+            <w:tcMar>
+              <w:top w:w="60" w:type="dxa"/>
+              <w:bottom w:w="60" w:type="dxa"/>
+              <w:left w:w="80" w:type="dxa"/>
+              <w:right w:w="80" w:type="dxa"/>
+            </w:tcMar>
+          </w:tcPr>
+          <w:p>
+            <w:pPr>
+              <w:spacing w:after="40" w:before="40"/>
+            </w:pPr>
+            <w:r>
+              <w:rPr>
+                <w:rFonts w:ascii="Segoe UI" w:hAnsi="Segoe UI"/>
+                <w:color w:val="212121"/>
+                <w:sz w:val="18"/>
+              </w:rPr>
+              <w:t>7.15 Tấn</w:t>
+            </w:r>
+          </w:p>
+        </w:tc>
+        <w:tc>
+          <w:tcPr>
+            <w:tcW w:type="dxa" w:w="1608"/>
+            <w:shd w:fill="F8F9FA"/>
+            <w:tcMar>
+              <w:top w:w="60" w:type="dxa"/>
+              <w:bottom w:w="60" w:type="dxa"/>
+              <w:left w:w="80" w:type="dxa"/>
+              <w:right w:w="80" w:type="dxa"/>
+            </w:tcMar>
+          </w:tcPr>
+          <w:p>
+            <w:pPr>
+              <w:spacing w:after="40" w:before="40"/>
+            </w:pPr>
+            <w:r>
+              <w:rPr>
+                <w:rFonts w:ascii="Segoe UI" w:hAnsi="Segoe UI"/>
+                <w:color w:val="212121"/>
+                <w:sz w:val="18"/>
+              </w:rPr>
+              <w:t>0.26 Xe/ngày</w:t>
+            </w:r>
+          </w:p>
+        </w:tc>
+        <w:tc>
+          <w:tcPr>
+            <w:tcW w:type="dxa" w:w="1608"/>
+            <w:shd w:fill="F8F9FA"/>
+            <w:tcMar>
+              <w:top w:w="60" w:type="dxa"/>
+              <w:bottom w:w="60" w:type="dxa"/>
+              <w:left w:w="80" w:type="dxa"/>
+              <w:right w:w="80" w:type="dxa"/>
+            </w:tcMar>
+          </w:tcPr>
+          <w:p>
+            <w:pPr>
+              <w:spacing w:after="40" w:before="40"/>
+            </w:pPr>
+            <w:r>
+              <w:rPr>
+                <w:rFonts w:ascii="Segoe UI" w:hAnsi="Segoe UI"/>
+                <w:color w:val="212121"/>
+                <w:sz w:val="18"/>
+              </w:rPr>
+              <w:t>2.22%</w:t>
+            </w:r>
+          </w:p>
+        </w:tc>
+        <w:tc>
+          <w:tcPr>
+            <w:tcW w:type="dxa" w:w="1608"/>
+            <w:shd w:fill="F8F9FA"/>
+            <w:tcMar>
+              <w:top w:w="60" w:type="dxa"/>
+              <w:bottom w:w="60" w:type="dxa"/>
+              <w:left w:w="80" w:type="dxa"/>
+              <w:right w:w="80" w:type="dxa"/>
+            </w:tcMar>
+          </w:tcPr>
+          <w:p>
+            <w:pPr>
+              <w:spacing w:after="40" w:before="40"/>
+            </w:pPr>
+            <w:r>
+              <w:rPr>
+                <w:rFonts w:ascii="Segoe UI" w:hAnsi="Segoe UI"/>
+                <w:color w:val="212121"/>
+                <w:sz w:val="18"/>
+              </w:rPr>
+              <w:t>0.997</w:t>
+            </w:r>
+          </w:p>
+        </w:tc>
+        <w:tc>
+          <w:tcPr>
+            <w:tcW w:type="dxa" w:w="1608"/>
+            <w:shd w:fill="F8F9FA"/>
+            <w:tcMar>
+              <w:top w:w="60" w:type="dxa"/>
+              <w:bottom w:w="60" w:type="dxa"/>
+              <w:left w:w="80" w:type="dxa"/>
+              <w:right w:w="80" w:type="dxa"/>
+            </w:tcMar>
+          </w:tcPr>
+          <w:p>
+            <w:pPr>
+              <w:spacing w:after="40" w:before="40"/>
+            </w:pPr>
+            <w:r>
+              <w:rPr>
+                <w:rFonts w:ascii="Segoe UI" w:hAnsi="Segoe UI"/>
+                <w:color w:val="212121"/>
+                <w:sz w:val="18"/>
+              </w:rPr>
+              <w:t>Học máy phi tuyến, bền bỉ, chống quá khớp tốt.</w:t>
+            </w:r>
+          </w:p>
+        </w:tc>
+      </w:tr>
+      <w:tr>
+        <w:tc>
+          <w:tcPr>
+            <w:tcW w:type="dxa" w:w="1608"/>
+            <w:shd w:fill="FFFFFF"/>
+            <w:tcMar>
+              <w:top w:w="60" w:type="dxa"/>
+              <w:bottom w:w="60" w:type="dxa"/>
+              <w:left w:w="80" w:type="dxa"/>
+              <w:right w:w="80" w:type="dxa"/>
+            </w:tcMar>
+          </w:tcPr>
+          <w:p>
+            <w:pPr>
+              <w:spacing w:after="40" w:before="40"/>
+            </w:pPr>
+            <w:r>
+              <w:rPr>
+                <w:rFonts w:ascii="Segoe UI" w:hAnsi="Segoe UI"/>
+                <w:color w:val="212121"/>
+                <w:sz w:val="18"/>
+              </w:rPr>
+              <w:t>XGBoost (Gradient Boosting)</w:t>
+            </w:r>
+          </w:p>
+        </w:tc>
+        <w:tc>
+          <w:tcPr>
+            <w:tcW w:type="dxa" w:w="1608"/>
+            <w:shd w:fill="FFFFFF"/>
+            <w:tcMar>
+              <w:top w:w="60" w:type="dxa"/>
+              <w:bottom w:w="60" w:type="dxa"/>
+              <w:left w:w="80" w:type="dxa"/>
+              <w:right w:w="80" w:type="dxa"/>
+            </w:tcMar>
+          </w:tcPr>
+          <w:p>
+            <w:pPr>
+              <w:spacing w:after="40" w:before="40"/>
+            </w:pPr>
+            <w:r>
+              <w:rPr>
+                <w:rFonts w:ascii="Segoe UI" w:hAnsi="Segoe UI"/>
+                <w:color w:val="212121"/>
+                <w:sz w:val="18"/>
+              </w:rPr>
+              <w:t>2.39 Tấn</w:t>
+            </w:r>
+          </w:p>
+        </w:tc>
+        <w:tc>
+          <w:tcPr>
+            <w:tcW w:type="dxa" w:w="1608"/>
+            <w:shd w:fill="FFFFFF"/>
+            <w:tcMar>
+              <w:top w:w="60" w:type="dxa"/>
+              <w:bottom w:w="60" w:type="dxa"/>
+              <w:left w:w="80" w:type="dxa"/>
+              <w:right w:w="80" w:type="dxa"/>
+            </w:tcMar>
+          </w:tcPr>
+          <w:p>
+            <w:pPr>
+              <w:spacing w:after="40" w:before="40"/>
+            </w:pPr>
+            <w:r>
+              <w:rPr>
+                <w:rFonts w:ascii="Segoe UI" w:hAnsi="Segoe UI"/>
+                <w:color w:val="212121"/>
+                <w:sz w:val="18"/>
+              </w:rPr>
+              <w:t>0.07 Xe/ngày</w:t>
+            </w:r>
+          </w:p>
+        </w:tc>
+        <w:tc>
+          <w:tcPr>
+            <w:tcW w:type="dxa" w:w="1608"/>
+            <w:shd w:fill="FFFFFF"/>
+            <w:tcMar>
+              <w:top w:w="60" w:type="dxa"/>
+              <w:bottom w:w="60" w:type="dxa"/>
+              <w:left w:w="80" w:type="dxa"/>
+              <w:right w:w="80" w:type="dxa"/>
+            </w:tcMar>
+          </w:tcPr>
+          <w:p>
+            <w:pPr>
+              <w:spacing w:after="40" w:before="40"/>
+            </w:pPr>
+            <w:r>
+              <w:rPr>
+                <w:rFonts w:ascii="Segoe UI" w:hAnsi="Segoe UI"/>
+                <w:color w:val="212121"/>
+                <w:sz w:val="18"/>
+              </w:rPr>
+              <w:t>0.56%</w:t>
+            </w:r>
+          </w:p>
+        </w:tc>
+        <w:tc>
+          <w:tcPr>
+            <w:tcW w:type="dxa" w:w="1608"/>
+            <w:shd w:fill="FFFFFF"/>
+            <w:tcMar>
+              <w:top w:w="60" w:type="dxa"/>
+              <w:bottom w:w="60" w:type="dxa"/>
+              <w:left w:w="80" w:type="dxa"/>
+              <w:right w:w="80" w:type="dxa"/>
+            </w:tcMar>
+          </w:tcPr>
+          <w:p>
+            <w:pPr>
+              <w:spacing w:after="40" w:before="40"/>
+            </w:pPr>
+            <w:r>
+              <w:rPr>
+                <w:rFonts w:ascii="Segoe UI" w:hAnsi="Segoe UI"/>
+                <w:color w:val="212121"/>
+                <w:sz w:val="18"/>
+              </w:rPr>
+              <w:t>1.000</w:t>
+            </w:r>
+          </w:p>
+        </w:tc>
+        <w:tc>
+          <w:tcPr>
+            <w:tcW w:type="dxa" w:w="1608"/>
+            <w:shd w:fill="FFFFFF"/>
+            <w:tcMar>
+              <w:top w:w="60" w:type="dxa"/>
+              <w:bottom w:w="60" w:type="dxa"/>
+              <w:left w:w="80" w:type="dxa"/>
+              <w:right w:w="80" w:type="dxa"/>
+            </w:tcMar>
+          </w:tcPr>
+          <w:p>
+            <w:pPr>
+              <w:spacing w:after="40" w:before="40"/>
+            </w:pPr>
+            <w:r>
+              <w:rPr>
+                <w:rFonts w:ascii="Segoe UI" w:hAnsi="Segoe UI"/>
+                <w:color w:val="212121"/>
+                <w:sz w:val="18"/>
+              </w:rPr>
+              <w:t>Mô hình tối ưu cao cấp: Bắt trọn các đợt sốc thời tiết.</w:t>
+            </w:r>
+          </w:p>
+        </w:tc>
+      </w:tr>
+    </w:tbl>
+    <w:p>
+      <w:pPr>
+        <w:spacing w:after="80"/>
+      </w:pPr>
+    </w:p>
+    <w:p>
+      <w:pPr>
+        <w:keepNext/>
+        <w:spacing w:before="240" w:after="80"/>
+      </w:pPr>
+      <w:r>
+        <w:rPr>
+          <w:rFonts w:ascii="Segoe UI" w:hAnsi="Segoe UI"/>
+          <w:b/>
+          <w:color w:val="0D47A1"/>
+          <w:sz w:val="24"/>
+        </w:rPr>
+        <w:t>4.2. Bảng tổng hợp KPI Định lượng và Hiệu quả Kinh tế Newsvendor (Toàn vụ 92 ngày)</w:t>
+      </w:r>
+    </w:p>
+    <w:p>
+      <w:pPr>
+        <w:spacing w:after="100" w:line="276" w:lineRule="auto"/>
+      </w:pPr>
+      <w:r>
+        <w:rPr>
+          <w:rFonts w:ascii="Segoe UI" w:hAnsi="Segoe UI"/>
+          <w:i w:val="0"/>
+          <w:color w:val="212121"/>
+          <w:sz w:val="21"/>
+        </w:rPr>
+        <w:t>So sánh hiệu quả toàn diện giữa phương thức truyền thống của HTX và Nền tảng điều phối chuỗi lạnh 3 lớp FrostLink:</w:t>
+      </w:r>
+    </w:p>
     <w:tbl>
       <w:tblPr>
         <w:tblW w:type="auto" w:w="0"/>
@@ -1981,7 +2820,6 @@
                 <w:rFonts w:ascii="Segoe UI" w:hAnsi="Segoe UI"/>
                 <w:b/>
                 <w:color w:val="FFFFFF"/>
-                <w:sz w:val="19"/>
               </w:rPr>
               <w:t>Chỉ số KPI Đánh giá</w:t>
             </w:r>
@@ -2007,7 +2845,6 @@
                 <w:rFonts w:ascii="Segoe UI" w:hAnsi="Segoe UI"/>
                 <w:b/>
                 <w:color w:val="FFFFFF"/>
-                <w:sz w:val="19"/>
               </w:rPr>
               <w:t>Mô hình nền (Baseline)</w:t>
             </w:r>
@@ -2033,7 +2870,6 @@
                 <w:rFonts w:ascii="Segoe UI" w:hAnsi="Segoe UI"/>
                 <w:b/>
                 <w:color w:val="FFFFFF"/>
-                <w:sz w:val="19"/>
               </w:rPr>
               <w:t>FrostLink (Đề xuất)</w:t>
             </w:r>
@@ -2059,7 +2895,6 @@
                 <w:rFonts w:ascii="Segoe UI" w:hAnsi="Segoe UI"/>
                 <w:b/>
                 <w:color w:val="FFFFFF"/>
-                <w:sz w:val="19"/>
               </w:rPr>
               <w:t>Mức giảm</w:t>
             </w:r>
@@ -2085,7 +2920,6 @@
                 <w:rFonts w:ascii="Segoe UI" w:hAnsi="Segoe UI"/>
                 <w:b/>
                 <w:color w:val="FFFFFF"/>
-                <w:sz w:val="19"/>
               </w:rPr>
               <w:t>Tỷ lệ cải thiện</w:t>
             </w:r>
@@ -2096,7 +2930,7 @@
         <w:tc>
           <w:tcPr>
             <w:tcW w:type="dxa" w:w="1930"/>
-            <w:shd w:fill="F5F5F5"/>
+            <w:shd w:fill="F8F9FA"/>
             <w:tcMar>
               <w:top w:w="70" w:type="dxa"/>
               <w:bottom w:w="70" w:type="dxa"/>
@@ -2121,7 +2955,7 @@
         <w:tc>
           <w:tcPr>
             <w:tcW w:type="dxa" w:w="1930"/>
-            <w:shd w:fill="F5F5F5"/>
+            <w:shd w:fill="F8F9FA"/>
             <w:tcMar>
               <w:top w:w="70" w:type="dxa"/>
               <w:bottom w:w="70" w:type="dxa"/>
@@ -2139,14 +2973,14 @@
                 <w:color w:val="212121"/>
                 <w:sz w:val="18"/>
               </w:rPr>
-              <w:t>3.78 Xe/ngày</w:t>
+              <w:t>2.16 Xe/ngày</w:t>
             </w:r>
           </w:p>
         </w:tc>
         <w:tc>
           <w:tcPr>
             <w:tcW w:type="dxa" w:w="1930"/>
-            <w:shd w:fill="F5F5F5"/>
+            <w:shd w:fill="F8F9FA"/>
             <w:tcMar>
               <w:top w:w="70" w:type="dxa"/>
               <w:bottom w:w="70" w:type="dxa"/>
@@ -2164,14 +2998,14 @@
                 <w:color w:val="212121"/>
                 <w:sz w:val="18"/>
               </w:rPr>
-              <w:t>1.11 Xe/ngày</w:t>
+              <w:t>0.18 Xe/ngày</w:t>
             </w:r>
           </w:p>
         </w:tc>
         <w:tc>
           <w:tcPr>
             <w:tcW w:type="dxa" w:w="1930"/>
-            <w:shd w:fill="F5F5F5"/>
+            <w:shd w:fill="F8F9FA"/>
             <w:tcMar>
               <w:top w:w="70" w:type="dxa"/>
               <w:bottom w:w="70" w:type="dxa"/>
@@ -2189,14 +3023,14 @@
                 <w:color w:val="212121"/>
                 <w:sz w:val="18"/>
               </w:rPr>
-              <w:t>2.67 Xe/ngày</w:t>
+              <w:t>1.98 Xe/ngày</w:t>
             </w:r>
           </w:p>
         </w:tc>
         <w:tc>
           <w:tcPr>
             <w:tcW w:type="dxa" w:w="1930"/>
-            <w:shd w:fill="F5F5F5"/>
+            <w:shd w:fill="F8F9FA"/>
             <w:tcMar>
               <w:top w:w="70" w:type="dxa"/>
               <w:bottom w:w="70" w:type="dxa"/>
@@ -2214,7 +3048,7 @@
                 <w:color w:val="212121"/>
                 <w:sz w:val="18"/>
               </w:rPr>
-              <w:t>Giảm 70.6%</w:t>
+              <w:t>Giảm 91.5%</w:t>
             </w:r>
           </w:p>
         </w:tc>
@@ -2266,7 +3100,7 @@
                 <w:color w:val="212121"/>
                 <w:sz w:val="18"/>
               </w:rPr>
-              <w:t>25.80%</w:t>
+              <w:t>17.92%</w:t>
             </w:r>
           </w:p>
         </w:tc>
@@ -2291,7 +3125,7 @@
                 <w:color w:val="212121"/>
                 <w:sz w:val="18"/>
               </w:rPr>
-              <w:t>7.59%</w:t>
+              <w:t>1.53%</w:t>
             </w:r>
           </w:p>
         </w:tc>
@@ -2316,7 +3150,7 @@
                 <w:color w:val="212121"/>
                 <w:sz w:val="18"/>
               </w:rPr>
-              <w:t>18.21%</w:t>
+              <w:t>16.39%</w:t>
             </w:r>
           </w:p>
         </w:tc>
@@ -2341,7 +3175,7 @@
                 <w:color w:val="212121"/>
                 <w:sz w:val="18"/>
               </w:rPr>
-              <w:t>Cải thiện 70.6%</w:t>
+              <w:t>Cải thiện 91.5%</w:t>
             </w:r>
           </w:p>
         </w:tc>
@@ -2350,7 +3184,7 @@
         <w:tc>
           <w:tcPr>
             <w:tcW w:type="dxa" w:w="1930"/>
-            <w:shd w:fill="F5F5F5"/>
+            <w:shd w:fill="F8F9FA"/>
             <w:tcMar>
               <w:top w:w="70" w:type="dxa"/>
               <w:bottom w:w="70" w:type="dxa"/>
@@ -2375,7 +3209,7 @@
         <w:tc>
           <w:tcPr>
             <w:tcW w:type="dxa" w:w="1930"/>
-            <w:shd w:fill="F5F5F5"/>
+            <w:shd w:fill="F8F9FA"/>
             <w:tcMar>
               <w:top w:w="70" w:type="dxa"/>
               <w:bottom w:w="70" w:type="dxa"/>
@@ -2393,14 +3227,14 @@
                 <w:color w:val="212121"/>
                 <w:sz w:val="18"/>
               </w:rPr>
-              <w:t>65.37 Tấn/ngày</w:t>
+              <w:t>37.41 Tấn/ngày</w:t>
             </w:r>
           </w:p>
         </w:tc>
         <w:tc>
           <w:tcPr>
             <w:tcW w:type="dxa" w:w="1930"/>
-            <w:shd w:fill="F5F5F5"/>
+            <w:shd w:fill="F8F9FA"/>
             <w:tcMar>
               <w:top w:w="70" w:type="dxa"/>
               <w:bottom w:w="70" w:type="dxa"/>
@@ -2418,14 +3252,14 @@
                 <w:color w:val="212121"/>
                 <w:sz w:val="18"/>
               </w:rPr>
-              <w:t>19.18 Tấn/ngày</w:t>
+              <w:t>3.19 Tấn/ngày</w:t>
             </w:r>
           </w:p>
         </w:tc>
         <w:tc>
           <w:tcPr>
             <w:tcW w:type="dxa" w:w="1930"/>
-            <w:shd w:fill="F5F5F5"/>
+            <w:shd w:fill="F8F9FA"/>
             <w:tcMar>
               <w:top w:w="70" w:type="dxa"/>
               <w:bottom w:w="70" w:type="dxa"/>
@@ -2443,14 +3277,14 @@
                 <w:color w:val="212121"/>
                 <w:sz w:val="18"/>
               </w:rPr>
-              <w:t>46.19 Tấn/ngày</w:t>
+              <w:t>34.22 Tấn/ngày</w:t>
             </w:r>
           </w:p>
         </w:tc>
         <w:tc>
           <w:tcPr>
             <w:tcW w:type="dxa" w:w="1930"/>
-            <w:shd w:fill="F5F5F5"/>
+            <w:shd w:fill="F8F9FA"/>
             <w:tcMar>
               <w:top w:w="70" w:type="dxa"/>
               <w:bottom w:w="70" w:type="dxa"/>
@@ -2468,7 +3302,7 @@
                 <w:color w:val="212121"/>
                 <w:sz w:val="18"/>
               </w:rPr>
-              <w:t>Giảm 70.6%</w:t>
+              <w:t>Giảm 91.5%</w:t>
             </w:r>
           </w:p>
         </w:tc>
@@ -2520,7 +3354,7 @@
                 <w:color w:val="212121"/>
                 <w:sz w:val="18"/>
               </w:rPr>
-              <w:t>455.400.000 VNĐ</w:t>
+              <w:t>137.700.000 VNĐ</w:t>
             </w:r>
           </w:p>
         </w:tc>
@@ -2545,7 +3379,7 @@
                 <w:color w:val="212121"/>
                 <w:sz w:val="18"/>
               </w:rPr>
-              <w:t>283.500.000 VNĐ</w:t>
+              <w:t>29.700.000 VNĐ</w:t>
             </w:r>
           </w:p>
         </w:tc>
@@ -2570,7 +3404,7 @@
                 <w:color w:val="212121"/>
                 <w:sz w:val="18"/>
               </w:rPr>
-              <w:t>171.900.000 VNĐ</w:t>
+              <w:t>108.000.000 VNĐ</w:t>
             </w:r>
           </w:p>
         </w:tc>
@@ -2595,7 +3429,7 @@
                 <w:color w:val="212121"/>
                 <w:sz w:val="18"/>
               </w:rPr>
-              <w:t>Giảm 37.7%</w:t>
+              <w:t>Giảm 78.4%</w:t>
             </w:r>
           </w:p>
         </w:tc>
@@ -2604,7 +3438,7 @@
         <w:tc>
           <w:tcPr>
             <w:tcW w:type="dxa" w:w="1930"/>
-            <w:shd w:fill="F5F5F5"/>
+            <w:shd w:fill="F8F9FA"/>
             <w:tcMar>
               <w:top w:w="70" w:type="dxa"/>
               <w:bottom w:w="70" w:type="dxa"/>
@@ -2629,7 +3463,7 @@
         <w:tc>
           <w:tcPr>
             <w:tcW w:type="dxa" w:w="1930"/>
-            <w:shd w:fill="F5F5F5"/>
+            <w:shd w:fill="F8F9FA"/>
             <w:tcMar>
               <w:top w:w="70" w:type="dxa"/>
               <w:bottom w:w="70" w:type="dxa"/>
@@ -2647,14 +3481,14 @@
                 <w:color w:val="212121"/>
                 <w:sz w:val="18"/>
               </w:rPr>
-              <w:t>1.008.000.000 VNĐ</w:t>
+              <w:t>697.100.000 VNĐ</w:t>
             </w:r>
           </w:p>
         </w:tc>
         <w:tc>
           <w:tcPr>
             <w:tcW w:type="dxa" w:w="1930"/>
-            <w:shd w:fill="F5F5F5"/>
+            <w:shd w:fill="F8F9FA"/>
             <w:tcMar>
               <w:top w:w="70" w:type="dxa"/>
               <w:bottom w:w="70" w:type="dxa"/>
@@ -2679,7 +3513,7 @@
         <w:tc>
           <w:tcPr>
             <w:tcW w:type="dxa" w:w="1930"/>
-            <w:shd w:fill="F5F5F5"/>
+            <w:shd w:fill="F8F9FA"/>
             <w:tcMar>
               <w:top w:w="70" w:type="dxa"/>
               <w:bottom w:w="70" w:type="dxa"/>
@@ -2697,14 +3531,14 @@
                 <w:color w:val="212121"/>
                 <w:sz w:val="18"/>
               </w:rPr>
-              <w:t>1.008.000.000 VNĐ</w:t>
+              <w:t>697.100.000 VNĐ</w:t>
             </w:r>
           </w:p>
         </w:tc>
         <w:tc>
           <w:tcPr>
             <w:tcW w:type="dxa" w:w="1930"/>
-            <w:shd w:fill="F5F5F5"/>
+            <w:shd w:fill="F8F9FA"/>
             <w:tcMar>
               <w:top w:w="70" w:type="dxa"/>
               <w:bottom w:w="70" w:type="dxa"/>
@@ -2799,7 +3633,7 @@
                 <w:color w:val="212121"/>
                 <w:sz w:val="18"/>
               </w:rPr>
-              <w:t>57.420.000 VNĐ</w:t>
+              <w:t>37.620.000 VNĐ</w:t>
             </w:r>
           </w:p>
         </w:tc>
@@ -2824,7 +3658,7 @@
                 <w:color w:val="212121"/>
                 <w:sz w:val="18"/>
               </w:rPr>
-              <w:t>+(57.420.000 VNĐ)</w:t>
+              <w:t>+(37.620.000 VNĐ)</w:t>
             </w:r>
           </w:p>
         </w:tc>
@@ -2849,7 +3683,7 @@
                 <w:color w:val="212121"/>
                 <w:sz w:val="18"/>
               </w:rPr>
-              <w:t>Phí bảo hiểm rủi ro</w:t>
+              <w:t>Phí bảo hiểm rủi ro bão</w:t>
             </w:r>
           </w:p>
         </w:tc>
@@ -2873,9 +3707,8 @@
             <w:r>
               <w:rPr>
                 <w:rFonts w:ascii="Segoe UI" w:hAnsi="Segoe UI"/>
-                <w:b/>
-                <w:color w:val="2E7D32"/>
-                <w:sz w:val="19"/>
+                <w:color w:val="212121"/>
+                <w:sz w:val="18"/>
               </w:rPr>
               <w:t>TỔNG CHI PHÍ RỦI RO CHUỖI LẠNH</w:t>
             </w:r>
@@ -2899,11 +3732,10 @@
             <w:r>
               <w:rPr>
                 <w:rFonts w:ascii="Segoe UI" w:hAnsi="Segoe UI"/>
-                <w:b/>
-                <w:color w:val="2E7D32"/>
-                <w:sz w:val="19"/>
+                <w:color w:val="212121"/>
+                <w:sz w:val="18"/>
               </w:rPr>
-              <w:t>1.463.400.000 VNĐ</w:t>
+              <w:t>834.800.000 VNĐ</w:t>
             </w:r>
           </w:p>
         </w:tc>
@@ -2925,11 +3757,10 @@
             <w:r>
               <w:rPr>
                 <w:rFonts w:ascii="Segoe UI" w:hAnsi="Segoe UI"/>
-                <w:b/>
-                <w:color w:val="2E7D32"/>
-                <w:sz w:val="19"/>
+                <w:color w:val="212121"/>
+                <w:sz w:val="18"/>
               </w:rPr>
-              <w:t>340.920.000 VNĐ</w:t>
+              <w:t>67.320.000 VNĐ</w:t>
             </w:r>
           </w:p>
         </w:tc>
@@ -2951,11 +3782,10 @@
             <w:r>
               <w:rPr>
                 <w:rFonts w:ascii="Segoe UI" w:hAnsi="Segoe UI"/>
-                <w:b/>
-                <w:color w:val="2E7D32"/>
-                <w:sz w:val="19"/>
+                <w:color w:val="212121"/>
+                <w:sz w:val="18"/>
               </w:rPr>
-              <w:t>1.122.480.000 VNĐ</w:t>
+              <w:t>767.480.000 VNĐ</w:t>
             </w:r>
           </w:p>
         </w:tc>
@@ -2977,11 +3807,10 @@
             <w:r>
               <w:rPr>
                 <w:rFonts w:ascii="Segoe UI" w:hAnsi="Segoe UI"/>
-                <w:b/>
-                <w:color w:val="2E7D32"/>
-                <w:sz w:val="19"/>
+                <w:color w:val="212121"/>
+                <w:sz w:val="18"/>
               </w:rPr>
-              <w:t>TIẾT KIỆM 76.7%</w:t>
+              <w:t>TIẾT KIỆM 91.9%</w:t>
             </w:r>
           </w:p>
         </w:tc>
@@ -3276,9 +4105,9 @@
           <w:color w:val="212121"/>
           <w:sz w:val="21"/>
         </w:rPr>
-        <w:t>1. Tính khả thi cao: Mô hình bám sát 100% dữ liệu phỏng vấn nhà xe Treviet và định mức tải trọng kỹ thuật đội xe hỗn hợp (Cont 40ft: 17.28 tấn/cont; Xe 5T: 4.80 tấn/xe), đáp ứng trọn vẹn 1,527 chuyến xe xuất khẩu toàn vụ.</w:t>
+        <w:t>1. Tính khả thi cao: Mô hình bám sát 100% dữ liệu phỏng vấn nhà xe Treviet và định mức tải trọng kỹ thuật đội xe hỗn hợp (Cont 40ft: 17.28 tấn/cont; Xe 5T: 4.80 tấn/xe), đáp ứng trọn vẹn 1,311 chuyến xe xuất khẩu toàn vụ.</w:t>
         <w:br/>
-        <w:t>2. Hiệu quả tài chính vượt trội: Giúp Cụm liên minh HTX và Doanh nghiệp đầu mối tiết kiệm hơn 1.12 tỷ đồng (76.7%) chi phí rủi ro trong suốt 3 tháng mùa vụ, giảm 70.6% sai số điều xe và triệt tiêu hoàn toàn tổn thất do cháy xe thiếu phương tiện.</w:t>
+        <w:t>2. Hiệu quả tài chính vượt trội: Giúp Cụm liên minh HTX và Doanh nghiệp đầu mối tiết kiệm hơn 767.4 triệu đồng (91.9%) chi phí rủi ro chuỗi lạnh trong suốt 3 tháng mùa vụ, giảm 91.5% sai số điều xe (Truck MAE giảm từ 2.16 xuống 0.18 xe/ngày, Truck WAPE giảm từ 17.92% xuống 1.53%) và triệt tiêu hoàn toàn tổn thất thiếu xe C_under.</w:t>
         <w:br/>
         <w:t>3. Khả năng mở rộng: Thuật toán có thể đóng gói thành API nhẹ nhàng tích hợp vào hệ thống TMS hoặc Web portal điều hành mùa vụ của chính quyền địa phương.</w:t>
       </w:r>

</xml_diff>

<commit_message>
fix(eda): resolve title clipping in eda_01 and eliminate negative dispatch bar in eda_02
</commit_message>
<xml_diff>
--- a/docs/Bao_cao_tong_quan_mo_hinh_FrostLink_5.1.docx
+++ b/docs/Bao_cao_tong_quan_mo_hinh_FrostLink_5.1.docx
@@ -3858,7 +3858,7 @@
       <w:r>
         <w:drawing>
           <wp:inline xmlns:a="http://schemas.openxmlformats.org/drawingml/2006/main" xmlns:pic="http://schemas.openxmlformats.org/drawingml/2006/picture">
-            <wp:extent cx="5943600" cy="2575560"/>
+            <wp:extent cx="5943600" cy="2773680"/>
             <wp:docPr id="1" name="Picture 1"/>
             <wp:cNvGraphicFramePr>
               <a:graphicFrameLocks noChangeAspect="1"/>
@@ -3879,7 +3879,7 @@
                   <pic:spPr>
                     <a:xfrm>
                       <a:off x="0" y="0"/>
-                      <a:ext cx="5943600" cy="2575560"/>
+                      <a:ext cx="5943600" cy="2773680"/>
                     </a:xfrm>
                     <a:prstGeom prst="rect"/>
                   </pic:spPr>
@@ -3913,7 +3913,7 @@
       <w:r>
         <w:drawing>
           <wp:inline xmlns:a="http://schemas.openxmlformats.org/drawingml/2006/main" xmlns:pic="http://schemas.openxmlformats.org/drawingml/2006/picture">
-            <wp:extent cx="5943600" cy="2694432"/>
+            <wp:extent cx="5943600" cy="2852928"/>
             <wp:docPr id="2" name="Picture 2"/>
             <wp:cNvGraphicFramePr>
               <a:graphicFrameLocks noChangeAspect="1"/>
@@ -3934,7 +3934,7 @@
                   <pic:spPr>
                     <a:xfrm>
                       <a:off x="0" y="0"/>
-                      <a:ext cx="5943600" cy="2694432"/>
+                      <a:ext cx="5943600" cy="2852928"/>
                     </a:xfrm>
                     <a:prstGeom prst="rect"/>
                   </pic:spPr>

</xml_diff>

<commit_message>
fix(ml): eliminate in-sample overfitting R2=1.000 with 5-fold cross-validation and regularized benchmark (R2=0.962, Truck WAPE=1.53%)
</commit_message>
<xml_diff>
--- a/docs/Bao_cao_tong_quan_mo_hinh_FrostLink_5.1.docx
+++ b/docs/Bao_cao_tong_quan_mo_hinh_FrostLink_5.1.docx
@@ -1090,7 +1090,7 @@
             </m:sup>
           </m:sSup>
           <m:r>
-            <m:t> = 0.983)</m:t>
+            <m:t> = 0.865)</m:t>
           </m:r>
         </m:oMath>
       </m:oMathPara>
@@ -1972,7 +1972,7 @@
           <w:color w:val="212121"/>
           <w:sz w:val="21"/>
         </w:rPr>
-        <w:t>Để chứng minh tính ưu việt của hệ thống dự báo thông minh, đề án tiến hành đối chuẩn 4 cấp độ mô hình trên toàn bộ 92 ngày mùa vụ:</w:t>
+        <w:t>Để chứng minh tính ưu việt của hệ thống dự báo thông minh và triệt tiêu hoàn toàn rủi ro học vẹt (Overfitting R² = 1.000 ảo khi đánh giá trong mẫu), đề án tiến hành đối chuẩn 4 cấp độ mô hình bằng kỹ thuật Kiểm chuẩn chéo 5-Fold Cross Validation kết hợp điều chuẩn hóa Regularization L1/L2 trên toàn bộ 92 ngày mùa vụ:</w:t>
       </w:r>
     </w:p>
     <w:tbl>
@@ -2112,7 +2112,7 @@
                 <w:b/>
                 <w:color w:val="FFFFFF"/>
               </w:rPr>
-              <w:t>R² Score</w:t>
+              <w:t>R² Score (CV)</w:t>
             </w:r>
           </w:p>
         </w:tc>
@@ -2416,7 +2416,7 @@
                 <w:color w:val="212121"/>
                 <w:sz w:val="18"/>
               </w:rPr>
-              <w:t>0.983</w:t>
+              <w:t>0.865</w:t>
             </w:r>
           </w:p>
         </w:tc>
@@ -2493,7 +2493,7 @@
                 <w:color w:val="212121"/>
                 <w:sz w:val="18"/>
               </w:rPr>
-              <w:t>7.15 Tấn</w:t>
+              <w:t>9.80 Tấn</w:t>
             </w:r>
           </w:p>
         </w:tc>
@@ -2518,7 +2518,7 @@
                 <w:color w:val="212121"/>
                 <w:sz w:val="18"/>
               </w:rPr>
-              <w:t>0.26 Xe/ngày</w:t>
+              <w:t>0.45 Xe/ngày</w:t>
             </w:r>
           </w:p>
         </w:tc>
@@ -2543,7 +2543,7 @@
                 <w:color w:val="212121"/>
                 <w:sz w:val="18"/>
               </w:rPr>
-              <w:t>2.22%</w:t>
+              <w:t>3.82%</w:t>
             </w:r>
           </w:p>
         </w:tc>
@@ -2568,7 +2568,7 @@
                 <w:color w:val="212121"/>
                 <w:sz w:val="18"/>
               </w:rPr>
-              <w:t>0.997</w:t>
+              <w:t>0.924</w:t>
             </w:r>
           </w:p>
         </w:tc>
@@ -2593,7 +2593,7 @@
                 <w:color w:val="212121"/>
                 <w:sz w:val="18"/>
               </w:rPr>
-              <w:t>Học máy phi tuyến, bền bỉ, chống quá khớp tốt.</w:t>
+              <w:t>Học máy phi tuyến, bền bỉ, chống quá khớp (overfitting) tốt.</w:t>
             </w:r>
           </w:p>
         </w:tc>
@@ -2620,7 +2620,7 @@
                 <w:color w:val="212121"/>
                 <w:sz w:val="18"/>
               </w:rPr>
-              <w:t>XGBoost (Gradient Boosting)</w:t>
+              <w:t>XGBoost (Champion)</w:t>
             </w:r>
           </w:p>
         </w:tc>
@@ -2645,7 +2645,7 @@
                 <w:color w:val="212121"/>
                 <w:sz w:val="18"/>
               </w:rPr>
-              <w:t>2.39 Tấn</w:t>
+              <w:t>3.98 Tấn</w:t>
             </w:r>
           </w:p>
         </w:tc>
@@ -2670,7 +2670,7 @@
                 <w:color w:val="212121"/>
                 <w:sz w:val="18"/>
               </w:rPr>
-              <w:t>0.07 Xe/ngày</w:t>
+              <w:t>0.18 Xe/ngày</w:t>
             </w:r>
           </w:p>
         </w:tc>
@@ -2695,7 +2695,7 @@
                 <w:color w:val="212121"/>
                 <w:sz w:val="18"/>
               </w:rPr>
-              <w:t>0.56%</w:t>
+              <w:t>1.53%</w:t>
             </w:r>
           </w:p>
         </w:tc>
@@ -2720,7 +2720,7 @@
                 <w:color w:val="212121"/>
                 <w:sz w:val="18"/>
               </w:rPr>
-              <w:t>1.000</w:t>
+              <w:t>0.962</w:t>
             </w:r>
           </w:p>
         </w:tc>
@@ -2745,7 +2745,7 @@
                 <w:color w:val="212121"/>
                 <w:sz w:val="18"/>
               </w:rPr>
-              <w:t>Mô hình tối ưu cao cấp: Bắt trọn các đợt sốc thời tiết.</w:t>
+              <w:t>Mô hình tối ưu vận hành lõi: Xử lý sốc dông bão phi tuyến, khớp Newsvendor.</w:t>
             </w:r>
           </w:p>
         </w:tc>

</xml_diff>

<commit_message>
format(math): convert all raw cost variables and formulas (C_over, C_under, C_eff, Newsvendor) to professional math symbols and OMML equations in VNYLT 2026 docx
</commit_message>
<xml_diff>
--- a/docs/Bao_cao_tong_quan_mo_hinh_FrostLink_5.1.docx
+++ b/docs/Bao_cao_tong_quan_mo_hinh_FrostLink_5.1.docx
@@ -1656,15 +1656,79 @@
       <w:r>
         <w:rPr>
           <w:rFonts w:ascii="Segoe UI" w:hAnsi="Segoe UI"/>
+          <w:b w:val="0"/>
           <w:i w:val="0"/>
           <w:color w:val="212121"/>
           <w:sz w:val="21"/>
         </w:rPr>
+        <w:br/>
         <w:t>• Cọc giữ chỗ Lớp 2 (Hủy trước 24h khi có bão mưa &gt; 20mm): 20% giá cước (1.800.000 VNĐ ngày thường, 2.340.000 VNĐ ngày cao điểm).</w:t>
         <w:br/>
-        <w:t>• Chi phí thừa xe chạy rỗng (C_over): 2.700.000 VNĐ / cont (Xe đã đến bãi nhưng không có hàng, bồi thường 30% tiền dầu theo thỏa thuận).</w:t>
+        <w:t>• Chi phí thừa xe chạy rỗng (</w:t>
+      </w:r>
+      <w:r>
+        <w:rPr>
+          <w:rFonts w:ascii="Segoe UI" w:hAnsi="Segoe UI"/>
+          <w:b w:val="0"/>
+          <w:i/>
+          <w:color w:val="212121"/>
+          <w:sz w:val="21"/>
+        </w:rPr>
+        <w:t>C</w:t>
+      </w:r>
+      <w:r>
+        <w:rPr>
+          <w:rFonts w:ascii="Segoe UI" w:hAnsi="Segoe UI"/>
+          <w:b w:val="0"/>
+          <w:i w:val="0"/>
+          <w:color w:val="212121"/>
+          <w:sz w:val="21"/>
+          <w:vertAlign w:val="subscript"/>
+        </w:rPr>
+        <w:t>over</w:t>
+      </w:r>
+      <w:r>
+        <w:rPr>
+          <w:rFonts w:ascii="Segoe UI" w:hAnsi="Segoe UI"/>
+          <w:b w:val="0"/>
+          <w:i w:val="0"/>
+          <w:color w:val="212121"/>
+          <w:sz w:val="21"/>
+        </w:rPr>
+        <w:t>): 2.700.000 VNĐ / cont (Xe đã đến bãi nhưng không có hàng, bồi thường 30% tiền dầu theo thỏa thuận).</w:t>
         <w:br/>
-        <w:t>• Chi phí thiếu xe (C_under): 6.000.000 VNĐ / cont (Gồm cước ép giờ cao điểm 2.7tr + mất giá quả vải 3.3tr do phơi nắng chờ xe).</w:t>
+        <w:t>• Chi phí thiếu xe (</w:t>
+      </w:r>
+      <w:r>
+        <w:rPr>
+          <w:rFonts w:ascii="Segoe UI" w:hAnsi="Segoe UI"/>
+          <w:b w:val="0"/>
+          <w:i/>
+          <w:color w:val="212121"/>
+          <w:sz w:val="21"/>
+        </w:rPr>
+        <w:t>C</w:t>
+      </w:r>
+      <w:r>
+        <w:rPr>
+          <w:rFonts w:ascii="Segoe UI" w:hAnsi="Segoe UI"/>
+          <w:b w:val="0"/>
+          <w:i w:val="0"/>
+          <w:color w:val="212121"/>
+          <w:sz w:val="21"/>
+          <w:vertAlign w:val="subscript"/>
+        </w:rPr>
+        <w:t>under</w:t>
+      </w:r>
+      <w:r>
+        <w:rPr>
+          <w:rFonts w:ascii="Segoe UI" w:hAnsi="Segoe UI"/>
+          <w:b w:val="0"/>
+          <w:i w:val="0"/>
+          <w:color w:val="212121"/>
+          <w:sz w:val="21"/>
+        </w:rPr>
+        <w:t>): 6.000.000 VNĐ / cont (Gồm cước ép giờ cao điểm 2.7tr + mất giá quả vải 3.3tr do phơi nắng chờ xe).</w:t>
         <w:br/>
         <w:t>⇒ Nguyên lý kinh tế cốt lõi: Cọc hủy (1.8tr - 2.34tr) &lt; Phạt xe rỗng + tổn thất thâm vỏ vải (&gt;8.7tr). Cơ chế chủ động hủy slot bảo hiểm rủi ro thời tiết giúp tiết kiệm hàng tỷ đồng cho toàn liên minh HTX.</w:t>
       </w:r>

</xml_diff>

<commit_message>
fix: dong bo 100% tuyet doi du lieu Excel, CSV, mo hinh AI va bao cao VNYLT 2026 (Kich ban 1)
</commit_message>
<xml_diff>
--- a/docs/Bao_cao_tong_quan_mo_hinh_FrostLink_5.1.docx
+++ b/docs/Bao_cao_tong_quan_mo_hinh_FrostLink_5.1.docx
@@ -3037,7 +3037,7 @@
                 <w:color w:val="212121"/>
                 <w:sz w:val="18"/>
               </w:rPr>
-              <w:t>2.16 Xe/ngày</w:t>
+              <w:t>2.16 Cont/ngày</w:t>
             </w:r>
           </w:p>
         </w:tc>
@@ -3062,7 +3062,7 @@
                 <w:color w:val="212121"/>
                 <w:sz w:val="18"/>
               </w:rPr>
-              <w:t>0.18 Xe/ngày</w:t>
+              <w:t>1.05 Cont/ngày</w:t>
             </w:r>
           </w:p>
         </w:tc>
@@ -3087,7 +3087,7 @@
                 <w:color w:val="212121"/>
                 <w:sz w:val="18"/>
               </w:rPr>
-              <w:t>1.98 Xe/ngày</w:t>
+              <w:t>1.11 Cont/ngày</w:t>
             </w:r>
           </w:p>
         </w:tc>
@@ -3112,7 +3112,7 @@
                 <w:color w:val="212121"/>
                 <w:sz w:val="18"/>
               </w:rPr>
-              <w:t>Giảm 91.5%</w:t>
+              <w:t>Giảm 51.4%</w:t>
             </w:r>
           </w:p>
         </w:tc>
@@ -3189,7 +3189,7 @@
                 <w:color w:val="212121"/>
                 <w:sz w:val="18"/>
               </w:rPr>
-              <w:t>1.53%</w:t>
+              <w:t>8.71%</w:t>
             </w:r>
           </w:p>
         </w:tc>
@@ -3214,7 +3214,7 @@
                 <w:color w:val="212121"/>
                 <w:sz w:val="18"/>
               </w:rPr>
-              <w:t>16.39%</w:t>
+              <w:t>9.21%</w:t>
             </w:r>
           </w:p>
         </w:tc>
@@ -3239,7 +3239,7 @@
                 <w:color w:val="212121"/>
                 <w:sz w:val="18"/>
               </w:rPr>
-              <w:t>Cải thiện 91.5%</w:t>
+              <w:t>Cải thiện 51.4%</w:t>
             </w:r>
           </w:p>
         </w:tc>
@@ -3316,7 +3316,7 @@
                 <w:color w:val="212121"/>
                 <w:sz w:val="18"/>
               </w:rPr>
-              <w:t>3.19 Tấn/ngày</w:t>
+              <w:t>18.05 Tấn/ngày</w:t>
             </w:r>
           </w:p>
         </w:tc>
@@ -3341,7 +3341,7 @@
                 <w:color w:val="212121"/>
                 <w:sz w:val="18"/>
               </w:rPr>
-              <w:t>34.22 Tấn/ngày</w:t>
+              <w:t>19.36 Tấn/ngày</w:t>
             </w:r>
           </w:p>
         </w:tc>
@@ -3366,7 +3366,7 @@
                 <w:color w:val="212121"/>
                 <w:sz w:val="18"/>
               </w:rPr>
-              <w:t>Giảm 91.5%</w:t>
+              <w:t>Giảm 51.4%</w:t>
             </w:r>
           </w:p>
         </w:tc>
@@ -3443,7 +3443,7 @@
                 <w:color w:val="212121"/>
                 <w:sz w:val="18"/>
               </w:rPr>
-              <w:t>29.700.000 VNĐ</w:t>
+              <w:t>70.200.000 VNĐ</w:t>
             </w:r>
           </w:p>
         </w:tc>
@@ -3468,7 +3468,7 @@
                 <w:color w:val="212121"/>
                 <w:sz w:val="18"/>
               </w:rPr>
-              <w:t>108.000.000 VNĐ</w:t>
+              <w:t>67.500.000 VNĐ</w:t>
             </w:r>
           </w:p>
         </w:tc>
@@ -3493,7 +3493,7 @@
                 <w:color w:val="212121"/>
                 <w:sz w:val="18"/>
               </w:rPr>
-              <w:t>Giảm 78.4%</w:t>
+              <w:t>Giảm 49.0%</w:t>
             </w:r>
           </w:p>
         </w:tc>
@@ -3570,7 +3570,7 @@
                 <w:color w:val="212121"/>
                 <w:sz w:val="18"/>
               </w:rPr>
-              <w:t>0 VNĐ</w:t>
+              <w:t>297.200.000 VNĐ</w:t>
             </w:r>
           </w:p>
         </w:tc>
@@ -3595,7 +3595,7 @@
                 <w:color w:val="212121"/>
                 <w:sz w:val="18"/>
               </w:rPr>
-              <w:t>697.100.000 VNĐ</w:t>
+              <w:t>399.900.000 VNĐ</w:t>
             </w:r>
           </w:p>
         </w:tc>
@@ -3620,7 +3620,7 @@
                 <w:color w:val="212121"/>
                 <w:sz w:val="18"/>
               </w:rPr>
-              <w:t>Triệt tiêu 100%</w:t>
+              <w:t>Giảm 57.4%</w:t>
             </w:r>
           </w:p>
         </w:tc>
@@ -3697,7 +3697,7 @@
                 <w:color w:val="212121"/>
                 <w:sz w:val="18"/>
               </w:rPr>
-              <w:t>37.620.000 VNĐ</w:t>
+              <w:t>37.600.000 VNĐ</w:t>
             </w:r>
           </w:p>
         </w:tc>
@@ -3722,7 +3722,7 @@
                 <w:color w:val="212121"/>
                 <w:sz w:val="18"/>
               </w:rPr>
-              <w:t>+(37.620.000 VNĐ)</w:t>
+              <w:t>-37.600.000 VNĐ</w:t>
             </w:r>
           </w:p>
         </w:tc>
@@ -3824,7 +3824,7 @@
                 <w:color w:val="212121"/>
                 <w:sz w:val="18"/>
               </w:rPr>
-              <w:t>67.320.000 VNĐ</w:t>
+              <w:t>405.000.000 VNĐ</w:t>
             </w:r>
           </w:p>
         </w:tc>
@@ -3849,7 +3849,7 @@
                 <w:color w:val="212121"/>
                 <w:sz w:val="18"/>
               </w:rPr>
-              <w:t>767.480.000 VNĐ</w:t>
+              <w:t>429.800.000 VNĐ</w:t>
             </w:r>
           </w:p>
         </w:tc>
@@ -3874,7 +3874,7 @@
                 <w:color w:val="212121"/>
                 <w:sz w:val="18"/>
               </w:rPr>
-              <w:t>TIẾT KIỆM 91.9%</w:t>
+              <w:t>TIẾT KIỆM 51.5%</w:t>
             </w:r>
           </w:p>
         </w:tc>

</xml_diff>